<commit_message>
Memory Leakage Bug Fixed
Fixed a memory leakage bug in the nav computer software.
</commit_message>
<xml_diff>
--- a/AIBus Information.docx
+++ b/AIBus Information.docx
@@ -844,6 +844,136 @@
             </w:pPr>
             <w:r>
               <w:rPr/>
+              <w:t>01 22 nn [...]</w:t>
+            </w:r>
+          </w:p>
+        </w:tc>
+        <w:tc>
+          <w:tcPr>
+            <w:tcW w:w="4277" w:type="dxa"/>
+            <w:tcBorders>
+              <w:left w:val="single" w:sz="4" w:space="0" w:color="000000"/>
+              <w:bottom w:val="single" w:sz="4" w:space="0" w:color="000000"/>
+              <w:right w:val="single" w:sz="4" w:space="0" w:color="000000"/>
+            </w:tcBorders>
+          </w:tcPr>
+          <w:p>
+            <w:pPr>
+              <w:pStyle w:val="TableContents"/>
+              <w:widowControl w:val="false"/>
+              <w:numPr>
+                <w:ilvl w:val="0"/>
+                <w:numId w:val="1"/>
+              </w:numPr>
+              <w:rPr>
+                <w:sz w:val="16"/>
+                <w:szCs w:val="16"/>
+              </w:rPr>
+            </w:pPr>
+            <w:r>
+              <w:rPr>
+                <w:sz w:val="16"/>
+                <w:szCs w:val="16"/>
+              </w:rPr>
+              <w:t>Short name of the audio device, sub-source nn.</w:t>
+            </w:r>
+          </w:p>
+        </w:tc>
+      </w:tr>
+      <w:tr>
+        <w:trPr/>
+        <w:tc>
+          <w:tcPr>
+            <w:tcW w:w="952" w:type="dxa"/>
+            <w:tcBorders>
+              <w:left w:val="single" w:sz="4" w:space="0" w:color="000000"/>
+              <w:bottom w:val="single" w:sz="4" w:space="0" w:color="000000"/>
+            </w:tcBorders>
+          </w:tcPr>
+          <w:p>
+            <w:pPr>
+              <w:pStyle w:val="TableContents"/>
+              <w:widowControl w:val="false"/>
+              <w:numPr>
+                <w:ilvl w:val="0"/>
+                <w:numId w:val="1"/>
+              </w:numPr>
+              <w:rPr/>
+            </w:pPr>
+            <w:r>
+              <w:rPr/>
+              <w:t>Any</w:t>
+            </w:r>
+          </w:p>
+        </w:tc>
+        <w:tc>
+          <w:tcPr>
+            <w:tcW w:w="821" w:type="dxa"/>
+            <w:tcBorders>
+              <w:left w:val="single" w:sz="4" w:space="0" w:color="000000"/>
+              <w:bottom w:val="single" w:sz="4" w:space="0" w:color="000000"/>
+            </w:tcBorders>
+          </w:tcPr>
+          <w:p>
+            <w:pPr>
+              <w:pStyle w:val="TableContents"/>
+              <w:widowControl w:val="false"/>
+              <w:numPr>
+                <w:ilvl w:val="0"/>
+                <w:numId w:val="1"/>
+              </w:numPr>
+              <w:rPr/>
+            </w:pPr>
+            <w:r>
+              <w:rPr/>
+              <w:t>Varies</w:t>
+            </w:r>
+          </w:p>
+        </w:tc>
+        <w:tc>
+          <w:tcPr>
+            <w:tcW w:w="1425" w:type="dxa"/>
+            <w:tcBorders>
+              <w:left w:val="single" w:sz="4" w:space="0" w:color="000000"/>
+              <w:bottom w:val="single" w:sz="4" w:space="0" w:color="000000"/>
+            </w:tcBorders>
+          </w:tcPr>
+          <w:p>
+            <w:pPr>
+              <w:pStyle w:val="TableContents"/>
+              <w:widowControl w:val="false"/>
+              <w:numPr>
+                <w:ilvl w:val="0"/>
+                <w:numId w:val="1"/>
+              </w:numPr>
+              <w:rPr/>
+            </w:pPr>
+            <w:r>
+              <w:rPr/>
+              <w:t>10</w:t>
+            </w:r>
+          </w:p>
+        </w:tc>
+        <w:tc>
+          <w:tcPr>
+            <w:tcW w:w="2497" w:type="dxa"/>
+            <w:tcBorders>
+              <w:left w:val="single" w:sz="4" w:space="0" w:color="000000"/>
+              <w:bottom w:val="single" w:sz="4" w:space="0" w:color="000000"/>
+            </w:tcBorders>
+          </w:tcPr>
+          <w:p>
+            <w:pPr>
+              <w:pStyle w:val="TableContents"/>
+              <w:widowControl w:val="false"/>
+              <w:numPr>
+                <w:ilvl w:val="0"/>
+                <w:numId w:val="1"/>
+              </w:numPr>
+              <w:rPr/>
+            </w:pPr>
+            <w:r>
+              <w:rPr/>
               <w:t>01 23 nn [...]</w:t>
             </w:r>
           </w:p>
@@ -7701,6 +7831,142 @@
                 <w:lang w:val="en-US" w:eastAsia="zh-CN" w:bidi="hi-IN"/>
               </w:rPr>
               <w:t>Clear the entire audio screen.</w:t>
+            </w:r>
+          </w:p>
+        </w:tc>
+      </w:tr>
+      <w:tr>
+        <w:trPr/>
+        <w:tc>
+          <w:tcPr>
+            <w:tcW w:w="952" w:type="dxa"/>
+            <w:tcBorders>
+              <w:left w:val="single" w:sz="4" w:space="0" w:color="000000"/>
+              <w:bottom w:val="single" w:sz="4" w:space="0" w:color="000000"/>
+            </w:tcBorders>
+          </w:tcPr>
+          <w:p>
+            <w:pPr>
+              <w:pStyle w:val="TableContents"/>
+              <w:widowControl w:val="false"/>
+              <w:numPr>
+                <w:ilvl w:val="0"/>
+                <w:numId w:val="1"/>
+              </w:numPr>
+              <w:rPr>
+                <w:sz w:val="22"/>
+                <w:szCs w:val="22"/>
+              </w:rPr>
+            </w:pPr>
+            <w:r>
+              <w:rPr>
+                <w:sz w:val="22"/>
+                <w:szCs w:val="22"/>
+              </w:rPr>
+              <w:t>10 (or audio source)</w:t>
+            </w:r>
+          </w:p>
+        </w:tc>
+        <w:tc>
+          <w:tcPr>
+            <w:tcW w:w="821" w:type="dxa"/>
+            <w:tcBorders>
+              <w:left w:val="single" w:sz="4" w:space="0" w:color="000000"/>
+              <w:bottom w:val="single" w:sz="4" w:space="0" w:color="000000"/>
+            </w:tcBorders>
+          </w:tcPr>
+          <w:p>
+            <w:pPr>
+              <w:pStyle w:val="TableContents"/>
+              <w:widowControl w:val="false"/>
+              <w:numPr>
+                <w:ilvl w:val="0"/>
+                <w:numId w:val="1"/>
+              </w:numPr>
+              <w:rPr/>
+            </w:pPr>
+            <w:r>
+              <w:rPr/>
+              <w:t>Varies</w:t>
+            </w:r>
+          </w:p>
+        </w:tc>
+        <w:tc>
+          <w:tcPr>
+            <w:tcW w:w="1425" w:type="dxa"/>
+            <w:tcBorders>
+              <w:left w:val="single" w:sz="4" w:space="0" w:color="000000"/>
+              <w:bottom w:val="single" w:sz="4" w:space="0" w:color="000000"/>
+            </w:tcBorders>
+          </w:tcPr>
+          <w:p>
+            <w:pPr>
+              <w:pStyle w:val="TableContents"/>
+              <w:widowControl w:val="false"/>
+              <w:numPr>
+                <w:ilvl w:val="0"/>
+                <w:numId w:val="1"/>
+              </w:numPr>
+              <w:rPr/>
+            </w:pPr>
+            <w:r>
+              <w:rPr/>
+              <w:t>01</w:t>
+            </w:r>
+          </w:p>
+        </w:tc>
+        <w:tc>
+          <w:tcPr>
+            <w:tcW w:w="2497" w:type="dxa"/>
+            <w:tcBorders>
+              <w:left w:val="single" w:sz="4" w:space="0" w:color="000000"/>
+              <w:bottom w:val="single" w:sz="4" w:space="0" w:color="000000"/>
+            </w:tcBorders>
+          </w:tcPr>
+          <w:p>
+            <w:pPr>
+              <w:pStyle w:val="TableContents"/>
+              <w:widowControl w:val="false"/>
+              <w:numPr>
+                <w:ilvl w:val="0"/>
+                <w:numId w:val="1"/>
+              </w:numPr>
+              <w:rPr/>
+            </w:pPr>
+            <w:r>
+              <w:rPr/>
+              <w:t>22 61 […]</w:t>
+            </w:r>
+          </w:p>
+        </w:tc>
+        <w:tc>
+          <w:tcPr>
+            <w:tcW w:w="4277" w:type="dxa"/>
+            <w:tcBorders>
+              <w:left w:val="single" w:sz="4" w:space="0" w:color="000000"/>
+              <w:bottom w:val="single" w:sz="4" w:space="0" w:color="000000"/>
+              <w:right w:val="single" w:sz="4" w:space="0" w:color="000000"/>
+            </w:tcBorders>
+          </w:tcPr>
+          <w:p>
+            <w:pPr>
+              <w:pStyle w:val="TableContents"/>
+              <w:widowControl w:val="false"/>
+              <w:numPr>
+                <w:ilvl w:val="0"/>
+                <w:numId w:val="1"/>
+              </w:numPr>
+              <w:rPr>
+                <w:sz w:val="16"/>
+                <w:szCs w:val="16"/>
+              </w:rPr>
+            </w:pPr>
+            <w:r>
+              <w:rPr>
+                <w:sz w:val="16"/>
+                <w:szCs w:val="16"/>
+              </w:rPr>
+              <w:t>Write text to the headerbar to be displayed briefly.</w:t>
             </w:r>
           </w:p>
         </w:tc>
@@ -18326,8 +18592,8 @@
       </w:tblPr>
       <w:tblGrid>
         <w:gridCol w:w="952"/>
-        <w:gridCol w:w="842"/>
-        <w:gridCol w:w="1404"/>
+        <w:gridCol w:w="838"/>
+        <w:gridCol w:w="1408"/>
         <w:gridCol w:w="2497"/>
         <w:gridCol w:w="4277"/>
       </w:tblGrid>
@@ -18370,7 +18636,7 @@
         </w:tc>
         <w:tc>
           <w:tcPr>
-            <w:tcW w:w="842" w:type="dxa"/>
+            <w:tcW w:w="838" w:type="dxa"/>
             <w:tcBorders>
               <w:top w:val="single" w:sz="4" w:space="0" w:color="000000"/>
               <w:left w:val="single" w:sz="4" w:space="0" w:color="000000"/>
@@ -18405,7 +18671,7 @@
         </w:tc>
         <w:tc>
           <w:tcPr>
-            <w:tcW w:w="1404" w:type="dxa"/>
+            <w:tcW w:w="1408" w:type="dxa"/>
             <w:tcBorders>
               <w:top w:val="single" w:sz="4" w:space="0" w:color="000000"/>
               <w:left w:val="single" w:sz="4" w:space="0" w:color="000000"/>
@@ -18548,7 +18814,7 @@
         </w:tc>
         <w:tc>
           <w:tcPr>
-            <w:tcW w:w="842" w:type="dxa"/>
+            <w:tcW w:w="838" w:type="dxa"/>
             <w:tcBorders>
               <w:left w:val="single" w:sz="4" w:space="0" w:color="000000"/>
               <w:bottom w:val="single" w:sz="4" w:space="0" w:color="000000"/>
@@ -18582,7 +18848,7 @@
         </w:tc>
         <w:tc>
           <w:tcPr>
-            <w:tcW w:w="1404" w:type="dxa"/>
+            <w:tcW w:w="1408" w:type="dxa"/>
             <w:tcBorders>
               <w:left w:val="single" w:sz="4" w:space="0" w:color="000000"/>
               <w:bottom w:val="single" w:sz="4" w:space="0" w:color="000000"/>
@@ -18726,7 +18992,7 @@
         </w:tc>
         <w:tc>
           <w:tcPr>
-            <w:tcW w:w="842" w:type="dxa"/>
+            <w:tcW w:w="838" w:type="dxa"/>
             <w:tcBorders>
               <w:left w:val="single" w:sz="4" w:space="0" w:color="000000"/>
               <w:bottom w:val="single" w:sz="4" w:space="0" w:color="000000"/>
@@ -18760,7 +19026,7 @@
         </w:tc>
         <w:tc>
           <w:tcPr>
-            <w:tcW w:w="1404" w:type="dxa"/>
+            <w:tcW w:w="1408" w:type="dxa"/>
             <w:tcBorders>
               <w:left w:val="single" w:sz="4" w:space="0" w:color="000000"/>
               <w:bottom w:val="single" w:sz="4" w:space="0" w:color="000000"/>
@@ -18904,7 +19170,7 @@
         </w:tc>
         <w:tc>
           <w:tcPr>
-            <w:tcW w:w="842" w:type="dxa"/>
+            <w:tcW w:w="838" w:type="dxa"/>
             <w:tcBorders>
               <w:left w:val="single" w:sz="4" w:space="0" w:color="000000"/>
               <w:bottom w:val="single" w:sz="4" w:space="0" w:color="000000"/>
@@ -18938,7 +19204,7 @@
         </w:tc>
         <w:tc>
           <w:tcPr>
-            <w:tcW w:w="1404" w:type="dxa"/>
+            <w:tcW w:w="1408" w:type="dxa"/>
             <w:tcBorders>
               <w:left w:val="single" w:sz="4" w:space="0" w:color="000000"/>
               <w:bottom w:val="single" w:sz="4" w:space="0" w:color="000000"/>
@@ -19082,7 +19348,7 @@
         </w:tc>
         <w:tc>
           <w:tcPr>
-            <w:tcW w:w="842" w:type="dxa"/>
+            <w:tcW w:w="838" w:type="dxa"/>
             <w:tcBorders>
               <w:left w:val="single" w:sz="4" w:space="0" w:color="000000"/>
               <w:bottom w:val="single" w:sz="4" w:space="0" w:color="000000"/>
@@ -19116,7 +19382,7 @@
         </w:tc>
         <w:tc>
           <w:tcPr>
-            <w:tcW w:w="1404" w:type="dxa"/>
+            <w:tcW w:w="1408" w:type="dxa"/>
             <w:tcBorders>
               <w:left w:val="single" w:sz="4" w:space="0" w:color="000000"/>
               <w:bottom w:val="single" w:sz="4" w:space="0" w:color="000000"/>
@@ -19260,7 +19526,7 @@
         </w:tc>
         <w:tc>
           <w:tcPr>
-            <w:tcW w:w="842" w:type="dxa"/>
+            <w:tcW w:w="838" w:type="dxa"/>
             <w:tcBorders>
               <w:left w:val="single" w:sz="4" w:space="0" w:color="000000"/>
               <w:bottom w:val="single" w:sz="4" w:space="0" w:color="000000"/>
@@ -19294,7 +19560,7 @@
         </w:tc>
         <w:tc>
           <w:tcPr>
-            <w:tcW w:w="1404" w:type="dxa"/>
+            <w:tcW w:w="1408" w:type="dxa"/>
             <w:tcBorders>
               <w:left w:val="single" w:sz="4" w:space="0" w:color="000000"/>
               <w:bottom w:val="single" w:sz="4" w:space="0" w:color="000000"/>
@@ -19438,7 +19704,7 @@
         </w:tc>
         <w:tc>
           <w:tcPr>
-            <w:tcW w:w="842" w:type="dxa"/>
+            <w:tcW w:w="838" w:type="dxa"/>
             <w:tcBorders>
               <w:left w:val="single" w:sz="4" w:space="0" w:color="000000"/>
               <w:bottom w:val="single" w:sz="4" w:space="0" w:color="000000"/>
@@ -19472,7 +19738,7 @@
         </w:tc>
         <w:tc>
           <w:tcPr>
-            <w:tcW w:w="1404" w:type="dxa"/>
+            <w:tcW w:w="1408" w:type="dxa"/>
             <w:tcBorders>
               <w:left w:val="single" w:sz="4" w:space="0" w:color="000000"/>
               <w:bottom w:val="single" w:sz="4" w:space="0" w:color="000000"/>
@@ -19616,7 +19882,7 @@
         </w:tc>
         <w:tc>
           <w:tcPr>
-            <w:tcW w:w="842" w:type="dxa"/>
+            <w:tcW w:w="838" w:type="dxa"/>
             <w:tcBorders>
               <w:left w:val="single" w:sz="4" w:space="0" w:color="000000"/>
               <w:bottom w:val="single" w:sz="4" w:space="0" w:color="000000"/>
@@ -19650,7 +19916,7 @@
         </w:tc>
         <w:tc>
           <w:tcPr>
-            <w:tcW w:w="1404" w:type="dxa"/>
+            <w:tcW w:w="1408" w:type="dxa"/>
             <w:tcBorders>
               <w:left w:val="single" w:sz="4" w:space="0" w:color="000000"/>
               <w:bottom w:val="single" w:sz="4" w:space="0" w:color="000000"/>
@@ -19794,7 +20060,7 @@
         </w:tc>
         <w:tc>
           <w:tcPr>
-            <w:tcW w:w="842" w:type="dxa"/>
+            <w:tcW w:w="838" w:type="dxa"/>
             <w:tcBorders>
               <w:left w:val="single" w:sz="4" w:space="0" w:color="000000"/>
               <w:bottom w:val="single" w:sz="4" w:space="0" w:color="000000"/>
@@ -19828,7 +20094,7 @@
         </w:tc>
         <w:tc>
           <w:tcPr>
-            <w:tcW w:w="1404" w:type="dxa"/>
+            <w:tcW w:w="1408" w:type="dxa"/>
             <w:tcBorders>
               <w:left w:val="single" w:sz="4" w:space="0" w:color="000000"/>
               <w:bottom w:val="single" w:sz="4" w:space="0" w:color="000000"/>
@@ -19972,7 +20238,7 @@
         </w:tc>
         <w:tc>
           <w:tcPr>
-            <w:tcW w:w="842" w:type="dxa"/>
+            <w:tcW w:w="838" w:type="dxa"/>
             <w:tcBorders>
               <w:left w:val="single" w:sz="4" w:space="0" w:color="000000"/>
               <w:bottom w:val="single" w:sz="4" w:space="0" w:color="000000"/>
@@ -20006,7 +20272,7 @@
         </w:tc>
         <w:tc>
           <w:tcPr>
-            <w:tcW w:w="1404" w:type="dxa"/>
+            <w:tcW w:w="1408" w:type="dxa"/>
             <w:tcBorders>
               <w:left w:val="single" w:sz="4" w:space="0" w:color="000000"/>
               <w:bottom w:val="single" w:sz="4" w:space="0" w:color="000000"/>
@@ -20410,7 +20676,7 @@
         </w:tc>
         <w:tc>
           <w:tcPr>
-            <w:tcW w:w="842" w:type="dxa"/>
+            <w:tcW w:w="838" w:type="dxa"/>
             <w:tcBorders>
               <w:left w:val="single" w:sz="4" w:space="0" w:color="000000"/>
               <w:bottom w:val="single" w:sz="4" w:space="0" w:color="000000"/>
@@ -20444,7 +20710,7 @@
         </w:tc>
         <w:tc>
           <w:tcPr>
-            <w:tcW w:w="1404" w:type="dxa"/>
+            <w:tcW w:w="1408" w:type="dxa"/>
             <w:tcBorders>
               <w:left w:val="single" w:sz="4" w:space="0" w:color="000000"/>
               <w:bottom w:val="single" w:sz="4" w:space="0" w:color="000000"/>
@@ -20588,7 +20854,7 @@
         </w:tc>
         <w:tc>
           <w:tcPr>
-            <w:tcW w:w="842" w:type="dxa"/>
+            <w:tcW w:w="838" w:type="dxa"/>
             <w:tcBorders>
               <w:left w:val="single" w:sz="4" w:space="0" w:color="000000"/>
               <w:bottom w:val="single" w:sz="4" w:space="0" w:color="000000"/>
@@ -20622,7 +20888,7 @@
         </w:tc>
         <w:tc>
           <w:tcPr>
-            <w:tcW w:w="1404" w:type="dxa"/>
+            <w:tcW w:w="1408" w:type="dxa"/>
             <w:tcBorders>
               <w:left w:val="single" w:sz="4" w:space="0" w:color="000000"/>
               <w:bottom w:val="single" w:sz="4" w:space="0" w:color="000000"/>
@@ -20766,7 +21032,7 @@
         </w:tc>
         <w:tc>
           <w:tcPr>
-            <w:tcW w:w="842" w:type="dxa"/>
+            <w:tcW w:w="838" w:type="dxa"/>
             <w:tcBorders>
               <w:left w:val="single" w:sz="4" w:space="0" w:color="000000"/>
               <w:bottom w:val="single" w:sz="4" w:space="0" w:color="000000"/>
@@ -20800,7 +21066,7 @@
         </w:tc>
         <w:tc>
           <w:tcPr>
-            <w:tcW w:w="1404" w:type="dxa"/>
+            <w:tcW w:w="1408" w:type="dxa"/>
             <w:tcBorders>
               <w:left w:val="single" w:sz="4" w:space="0" w:color="000000"/>
               <w:bottom w:val="single" w:sz="4" w:space="0" w:color="000000"/>
@@ -22864,8 +23130,8 @@
       </w:tblPr>
       <w:tblGrid>
         <w:gridCol w:w="952"/>
-        <w:gridCol w:w="842"/>
-        <w:gridCol w:w="1404"/>
+        <w:gridCol w:w="838"/>
+        <w:gridCol w:w="1408"/>
         <w:gridCol w:w="2497"/>
         <w:gridCol w:w="4277"/>
       </w:tblGrid>
@@ -22908,7 +23174,7 @@
         </w:tc>
         <w:tc>
           <w:tcPr>
-            <w:tcW w:w="842" w:type="dxa"/>
+            <w:tcW w:w="838" w:type="dxa"/>
             <w:tcBorders>
               <w:top w:val="single" w:sz="4" w:space="0" w:color="000000"/>
               <w:left w:val="single" w:sz="4" w:space="0" w:color="000000"/>
@@ -22943,7 +23209,7 @@
         </w:tc>
         <w:tc>
           <w:tcPr>
-            <w:tcW w:w="1404" w:type="dxa"/>
+            <w:tcW w:w="1408" w:type="dxa"/>
             <w:tcBorders>
               <w:top w:val="single" w:sz="4" w:space="0" w:color="000000"/>
               <w:left w:val="single" w:sz="4" w:space="0" w:color="000000"/>
@@ -23076,7 +23342,7 @@
         </w:tc>
         <w:tc>
           <w:tcPr>
-            <w:tcW w:w="842" w:type="dxa"/>
+            <w:tcW w:w="838" w:type="dxa"/>
             <w:tcBorders>
               <w:left w:val="single" w:sz="4" w:space="0" w:color="000000"/>
               <w:bottom w:val="single" w:sz="4" w:space="0" w:color="000000"/>
@@ -23100,7 +23366,7 @@
         </w:tc>
         <w:tc>
           <w:tcPr>
-            <w:tcW w:w="1404" w:type="dxa"/>
+            <w:tcW w:w="1408" w:type="dxa"/>
             <w:tcBorders>
               <w:left w:val="single" w:sz="4" w:space="0" w:color="000000"/>
               <w:bottom w:val="single" w:sz="4" w:space="0" w:color="000000"/>
@@ -23206,7 +23472,7 @@
         </w:tc>
         <w:tc>
           <w:tcPr>
-            <w:tcW w:w="842" w:type="dxa"/>
+            <w:tcW w:w="838" w:type="dxa"/>
             <w:tcBorders>
               <w:left w:val="single" w:sz="4" w:space="0" w:color="000000"/>
               <w:bottom w:val="single" w:sz="4" w:space="0" w:color="000000"/>
@@ -23230,7 +23496,7 @@
         </w:tc>
         <w:tc>
           <w:tcPr>
-            <w:tcW w:w="1404" w:type="dxa"/>
+            <w:tcW w:w="1408" w:type="dxa"/>
             <w:tcBorders>
               <w:left w:val="single" w:sz="4" w:space="0" w:color="000000"/>
               <w:bottom w:val="single" w:sz="4" w:space="0" w:color="000000"/>
@@ -23336,7 +23602,7 @@
         </w:tc>
         <w:tc>
           <w:tcPr>
-            <w:tcW w:w="842" w:type="dxa"/>
+            <w:tcW w:w="838" w:type="dxa"/>
             <w:tcBorders>
               <w:left w:val="single" w:sz="4" w:space="0" w:color="000000"/>
               <w:bottom w:val="single" w:sz="4" w:space="0" w:color="000000"/>
@@ -23360,7 +23626,7 @@
         </w:tc>
         <w:tc>
           <w:tcPr>
-            <w:tcW w:w="1404" w:type="dxa"/>
+            <w:tcW w:w="1408" w:type="dxa"/>
             <w:tcBorders>
               <w:left w:val="single" w:sz="4" w:space="0" w:color="000000"/>
               <w:bottom w:val="single" w:sz="4" w:space="0" w:color="000000"/>
@@ -23466,7 +23732,7 @@
         </w:tc>
         <w:tc>
           <w:tcPr>
-            <w:tcW w:w="842" w:type="dxa"/>
+            <w:tcW w:w="838" w:type="dxa"/>
             <w:tcBorders>
               <w:left w:val="single" w:sz="4" w:space="0" w:color="000000"/>
               <w:bottom w:val="single" w:sz="4" w:space="0" w:color="000000"/>
@@ -23490,7 +23756,7 @@
         </w:tc>
         <w:tc>
           <w:tcPr>
-            <w:tcW w:w="1404" w:type="dxa"/>
+            <w:tcW w:w="1408" w:type="dxa"/>
             <w:tcBorders>
               <w:left w:val="single" w:sz="4" w:space="0" w:color="000000"/>
               <w:bottom w:val="single" w:sz="4" w:space="0" w:color="000000"/>
@@ -23596,7 +23862,7 @@
         </w:tc>
         <w:tc>
           <w:tcPr>
-            <w:tcW w:w="842" w:type="dxa"/>
+            <w:tcW w:w="838" w:type="dxa"/>
             <w:tcBorders>
               <w:left w:val="single" w:sz="4" w:space="0" w:color="000000"/>
               <w:bottom w:val="single" w:sz="4" w:space="0" w:color="000000"/>
@@ -23620,7 +23886,7 @@
         </w:tc>
         <w:tc>
           <w:tcPr>
-            <w:tcW w:w="1404" w:type="dxa"/>
+            <w:tcW w:w="1408" w:type="dxa"/>
             <w:tcBorders>
               <w:left w:val="single" w:sz="4" w:space="0" w:color="000000"/>
               <w:bottom w:val="single" w:sz="4" w:space="0" w:color="000000"/>
@@ -23726,7 +23992,7 @@
         </w:tc>
         <w:tc>
           <w:tcPr>
-            <w:tcW w:w="842" w:type="dxa"/>
+            <w:tcW w:w="838" w:type="dxa"/>
             <w:tcBorders>
               <w:left w:val="single" w:sz="4" w:space="0" w:color="000000"/>
               <w:bottom w:val="single" w:sz="4" w:space="0" w:color="000000"/>
@@ -23750,7 +24016,7 @@
         </w:tc>
         <w:tc>
           <w:tcPr>
-            <w:tcW w:w="1404" w:type="dxa"/>
+            <w:tcW w:w="1408" w:type="dxa"/>
             <w:tcBorders>
               <w:left w:val="single" w:sz="4" w:space="0" w:color="000000"/>
               <w:bottom w:val="single" w:sz="4" w:space="0" w:color="000000"/>
@@ -23856,7 +24122,7 @@
         </w:tc>
         <w:tc>
           <w:tcPr>
-            <w:tcW w:w="842" w:type="dxa"/>
+            <w:tcW w:w="838" w:type="dxa"/>
             <w:tcBorders>
               <w:left w:val="single" w:sz="4" w:space="0" w:color="000000"/>
               <w:bottom w:val="single" w:sz="4" w:space="0" w:color="000000"/>
@@ -23880,7 +24146,7 @@
         </w:tc>
         <w:tc>
           <w:tcPr>
-            <w:tcW w:w="1404" w:type="dxa"/>
+            <w:tcW w:w="1408" w:type="dxa"/>
             <w:tcBorders>
               <w:left w:val="single" w:sz="4" w:space="0" w:color="000000"/>
               <w:bottom w:val="single" w:sz="4" w:space="0" w:color="000000"/>
@@ -23986,7 +24252,7 @@
         </w:tc>
         <w:tc>
           <w:tcPr>
-            <w:tcW w:w="842" w:type="dxa"/>
+            <w:tcW w:w="838" w:type="dxa"/>
             <w:tcBorders>
               <w:left w:val="single" w:sz="4" w:space="0" w:color="000000"/>
               <w:bottom w:val="single" w:sz="4" w:space="0" w:color="000000"/>
@@ -24010,7 +24276,7 @@
         </w:tc>
         <w:tc>
           <w:tcPr>
-            <w:tcW w:w="1404" w:type="dxa"/>
+            <w:tcW w:w="1408" w:type="dxa"/>
             <w:tcBorders>
               <w:left w:val="single" w:sz="4" w:space="0" w:color="000000"/>
               <w:bottom w:val="single" w:sz="4" w:space="0" w:color="000000"/>
@@ -24116,7 +24382,7 @@
         </w:tc>
         <w:tc>
           <w:tcPr>
-            <w:tcW w:w="842" w:type="dxa"/>
+            <w:tcW w:w="838" w:type="dxa"/>
             <w:tcBorders>
               <w:left w:val="single" w:sz="4" w:space="0" w:color="000000"/>
               <w:bottom w:val="single" w:sz="4" w:space="0" w:color="000000"/>
@@ -24140,7 +24406,7 @@
         </w:tc>
         <w:tc>
           <w:tcPr>
-            <w:tcW w:w="1404" w:type="dxa"/>
+            <w:tcW w:w="1408" w:type="dxa"/>
             <w:tcBorders>
               <w:left w:val="single" w:sz="4" w:space="0" w:color="000000"/>
               <w:bottom w:val="single" w:sz="4" w:space="0" w:color="000000"/>
@@ -24246,7 +24512,7 @@
         </w:tc>
         <w:tc>
           <w:tcPr>
-            <w:tcW w:w="842" w:type="dxa"/>
+            <w:tcW w:w="838" w:type="dxa"/>
             <w:tcBorders>
               <w:left w:val="single" w:sz="4" w:space="0" w:color="000000"/>
               <w:bottom w:val="single" w:sz="4" w:space="0" w:color="000000"/>
@@ -24270,7 +24536,7 @@
         </w:tc>
         <w:tc>
           <w:tcPr>
-            <w:tcW w:w="1404" w:type="dxa"/>
+            <w:tcW w:w="1408" w:type="dxa"/>
             <w:tcBorders>
               <w:left w:val="single" w:sz="4" w:space="0" w:color="000000"/>
               <w:bottom w:val="single" w:sz="4" w:space="0" w:color="000000"/>
@@ -24376,7 +24642,7 @@
         </w:tc>
         <w:tc>
           <w:tcPr>
-            <w:tcW w:w="842" w:type="dxa"/>
+            <w:tcW w:w="838" w:type="dxa"/>
             <w:tcBorders>
               <w:left w:val="single" w:sz="4" w:space="0" w:color="000000"/>
               <w:bottom w:val="single" w:sz="4" w:space="0" w:color="000000"/>
@@ -24400,7 +24666,7 @@
         </w:tc>
         <w:tc>
           <w:tcPr>
-            <w:tcW w:w="1404" w:type="dxa"/>
+            <w:tcW w:w="1408" w:type="dxa"/>
             <w:tcBorders>
               <w:left w:val="single" w:sz="4" w:space="0" w:color="000000"/>
               <w:bottom w:val="single" w:sz="4" w:space="0" w:color="000000"/>
@@ -24506,7 +24772,7 @@
         </w:tc>
         <w:tc>
           <w:tcPr>
-            <w:tcW w:w="842" w:type="dxa"/>
+            <w:tcW w:w="838" w:type="dxa"/>
             <w:tcBorders>
               <w:left w:val="single" w:sz="4" w:space="0" w:color="000000"/>
               <w:bottom w:val="single" w:sz="4" w:space="0" w:color="000000"/>
@@ -24530,7 +24796,7 @@
         </w:tc>
         <w:tc>
           <w:tcPr>
-            <w:tcW w:w="1404" w:type="dxa"/>
+            <w:tcW w:w="1408" w:type="dxa"/>
             <w:tcBorders>
               <w:left w:val="single" w:sz="4" w:space="0" w:color="000000"/>
               <w:bottom w:val="single" w:sz="4" w:space="0" w:color="000000"/>
@@ -24636,7 +24902,7 @@
         </w:tc>
         <w:tc>
           <w:tcPr>
-            <w:tcW w:w="842" w:type="dxa"/>
+            <w:tcW w:w="838" w:type="dxa"/>
             <w:tcBorders>
               <w:left w:val="single" w:sz="4" w:space="0" w:color="000000"/>
               <w:bottom w:val="single" w:sz="4" w:space="0" w:color="000000"/>
@@ -24660,7 +24926,7 @@
         </w:tc>
         <w:tc>
           <w:tcPr>
-            <w:tcW w:w="1404" w:type="dxa"/>
+            <w:tcW w:w="1408" w:type="dxa"/>
             <w:tcBorders>
               <w:left w:val="single" w:sz="4" w:space="0" w:color="000000"/>
               <w:bottom w:val="single" w:sz="4" w:space="0" w:color="000000"/>
@@ -24766,7 +25032,7 @@
         </w:tc>
         <w:tc>
           <w:tcPr>
-            <w:tcW w:w="842" w:type="dxa"/>
+            <w:tcW w:w="838" w:type="dxa"/>
             <w:tcBorders>
               <w:left w:val="single" w:sz="4" w:space="0" w:color="000000"/>
               <w:bottom w:val="single" w:sz="4" w:space="0" w:color="000000"/>
@@ -24790,7 +25056,7 @@
         </w:tc>
         <w:tc>
           <w:tcPr>
-            <w:tcW w:w="1404" w:type="dxa"/>
+            <w:tcW w:w="1408" w:type="dxa"/>
             <w:tcBorders>
               <w:left w:val="single" w:sz="4" w:space="0" w:color="000000"/>
               <w:bottom w:val="single" w:sz="4" w:space="0" w:color="000000"/>
@@ -24896,7 +25162,7 @@
         </w:tc>
         <w:tc>
           <w:tcPr>
-            <w:tcW w:w="842" w:type="dxa"/>
+            <w:tcW w:w="838" w:type="dxa"/>
             <w:tcBorders>
               <w:left w:val="single" w:sz="4" w:space="0" w:color="000000"/>
               <w:bottom w:val="single" w:sz="4" w:space="0" w:color="000000"/>
@@ -24920,7 +25186,7 @@
         </w:tc>
         <w:tc>
           <w:tcPr>
-            <w:tcW w:w="1404" w:type="dxa"/>
+            <w:tcW w:w="1408" w:type="dxa"/>
             <w:tcBorders>
               <w:left w:val="single" w:sz="4" w:space="0" w:color="000000"/>
               <w:bottom w:val="single" w:sz="4" w:space="0" w:color="000000"/>
@@ -28819,8 +29085,8 @@
       </w:tblPr>
       <w:tblGrid>
         <w:gridCol w:w="952"/>
-        <w:gridCol w:w="842"/>
-        <w:gridCol w:w="1404"/>
+        <w:gridCol w:w="838"/>
+        <w:gridCol w:w="1408"/>
         <w:gridCol w:w="2497"/>
         <w:gridCol w:w="4277"/>
       </w:tblGrid>
@@ -28863,7 +29129,7 @@
         </w:tc>
         <w:tc>
           <w:tcPr>
-            <w:tcW w:w="842" w:type="dxa"/>
+            <w:tcW w:w="838" w:type="dxa"/>
             <w:tcBorders>
               <w:top w:val="single" w:sz="4" w:space="0" w:color="000000"/>
               <w:left w:val="single" w:sz="4" w:space="0" w:color="000000"/>
@@ -28898,7 +29164,7 @@
         </w:tc>
         <w:tc>
           <w:tcPr>
-            <w:tcW w:w="1404" w:type="dxa"/>
+            <w:tcW w:w="1408" w:type="dxa"/>
             <w:tcBorders>
               <w:top w:val="single" w:sz="4" w:space="0" w:color="000000"/>
               <w:left w:val="single" w:sz="4" w:space="0" w:color="000000"/>
@@ -29031,7 +29297,7 @@
         </w:tc>
         <w:tc>
           <w:tcPr>
-            <w:tcW w:w="842" w:type="dxa"/>
+            <w:tcW w:w="838" w:type="dxa"/>
             <w:tcBorders>
               <w:left w:val="single" w:sz="4" w:space="0" w:color="000000"/>
               <w:bottom w:val="single" w:sz="4" w:space="0" w:color="000000"/>
@@ -29055,7 +29321,7 @@
         </w:tc>
         <w:tc>
           <w:tcPr>
-            <w:tcW w:w="1404" w:type="dxa"/>
+            <w:tcW w:w="1408" w:type="dxa"/>
             <w:tcBorders>
               <w:left w:val="single" w:sz="4" w:space="0" w:color="000000"/>
               <w:bottom w:val="single" w:sz="4" w:space="0" w:color="000000"/>
@@ -29211,7 +29477,7 @@
         </w:tc>
         <w:tc>
           <w:tcPr>
-            <w:tcW w:w="842" w:type="dxa"/>
+            <w:tcW w:w="838" w:type="dxa"/>
             <w:tcBorders>
               <w:left w:val="single" w:sz="4" w:space="0" w:color="000000"/>
               <w:bottom w:val="single" w:sz="4" w:space="0" w:color="000000"/>
@@ -29235,7 +29501,7 @@
         </w:tc>
         <w:tc>
           <w:tcPr>
-            <w:tcW w:w="1404" w:type="dxa"/>
+            <w:tcW w:w="1408" w:type="dxa"/>
             <w:tcBorders>
               <w:left w:val="single" w:sz="4" w:space="0" w:color="000000"/>
               <w:bottom w:val="single" w:sz="4" w:space="0" w:color="000000"/>
@@ -29343,7 +29609,7 @@
         </w:tc>
         <w:tc>
           <w:tcPr>
-            <w:tcW w:w="842" w:type="dxa"/>
+            <w:tcW w:w="838" w:type="dxa"/>
             <w:tcBorders>
               <w:left w:val="single" w:sz="4" w:space="0" w:color="000000"/>
               <w:bottom w:val="single" w:sz="4" w:space="0" w:color="000000"/>
@@ -29367,7 +29633,7 @@
         </w:tc>
         <w:tc>
           <w:tcPr>
-            <w:tcW w:w="1404" w:type="dxa"/>
+            <w:tcW w:w="1408" w:type="dxa"/>
             <w:tcBorders>
               <w:left w:val="single" w:sz="4" w:space="0" w:color="000000"/>
               <w:bottom w:val="single" w:sz="4" w:space="0" w:color="000000"/>
@@ -29475,7 +29741,7 @@
         </w:tc>
         <w:tc>
           <w:tcPr>
-            <w:tcW w:w="842" w:type="dxa"/>
+            <w:tcW w:w="838" w:type="dxa"/>
             <w:tcBorders>
               <w:left w:val="single" w:sz="4" w:space="0" w:color="000000"/>
               <w:bottom w:val="single" w:sz="4" w:space="0" w:color="000000"/>
@@ -29499,7 +29765,7 @@
         </w:tc>
         <w:tc>
           <w:tcPr>
-            <w:tcW w:w="1404" w:type="dxa"/>
+            <w:tcW w:w="1408" w:type="dxa"/>
             <w:tcBorders>
               <w:left w:val="single" w:sz="4" w:space="0" w:color="000000"/>
               <w:bottom w:val="single" w:sz="4" w:space="0" w:color="000000"/>
@@ -30032,7 +30298,7 @@
         </w:tc>
         <w:tc>
           <w:tcPr>
-            <w:tcW w:w="842" w:type="dxa"/>
+            <w:tcW w:w="838" w:type="dxa"/>
             <w:tcBorders>
               <w:left w:val="single" w:sz="4" w:space="0" w:color="000000"/>
               <w:bottom w:val="single" w:sz="4" w:space="0" w:color="000000"/>
@@ -30056,7 +30322,7 @@
         </w:tc>
         <w:tc>
           <w:tcPr>
-            <w:tcW w:w="1404" w:type="dxa"/>
+            <w:tcW w:w="1408" w:type="dxa"/>
             <w:tcBorders>
               <w:left w:val="single" w:sz="4" w:space="0" w:color="000000"/>
               <w:bottom w:val="single" w:sz="4" w:space="0" w:color="000000"/>
@@ -30164,7 +30430,7 @@
         </w:tc>
         <w:tc>
           <w:tcPr>
-            <w:tcW w:w="842" w:type="dxa"/>
+            <w:tcW w:w="838" w:type="dxa"/>
             <w:tcBorders>
               <w:left w:val="single" w:sz="4" w:space="0" w:color="000000"/>
               <w:bottom w:val="single" w:sz="4" w:space="0" w:color="000000"/>
@@ -30188,7 +30454,7 @@
         </w:tc>
         <w:tc>
           <w:tcPr>
-            <w:tcW w:w="1404" w:type="dxa"/>
+            <w:tcW w:w="1408" w:type="dxa"/>
             <w:tcBorders>
               <w:left w:val="single" w:sz="4" w:space="0" w:color="000000"/>
               <w:bottom w:val="single" w:sz="4" w:space="0" w:color="000000"/>
@@ -30296,7 +30562,7 @@
         </w:tc>
         <w:tc>
           <w:tcPr>
-            <w:tcW w:w="842" w:type="dxa"/>
+            <w:tcW w:w="838" w:type="dxa"/>
             <w:tcBorders>
               <w:left w:val="single" w:sz="4" w:space="0" w:color="000000"/>
               <w:bottom w:val="single" w:sz="4" w:space="0" w:color="000000"/>
@@ -30320,7 +30586,7 @@
         </w:tc>
         <w:tc>
           <w:tcPr>
-            <w:tcW w:w="1404" w:type="dxa"/>
+            <w:tcW w:w="1408" w:type="dxa"/>
             <w:tcBorders>
               <w:left w:val="single" w:sz="4" w:space="0" w:color="000000"/>
               <w:bottom w:val="single" w:sz="4" w:space="0" w:color="000000"/>
@@ -30428,7 +30694,7 @@
         </w:tc>
         <w:tc>
           <w:tcPr>
-            <w:tcW w:w="842" w:type="dxa"/>
+            <w:tcW w:w="838" w:type="dxa"/>
             <w:tcBorders>
               <w:left w:val="single" w:sz="4" w:space="0" w:color="000000"/>
               <w:bottom w:val="single" w:sz="4" w:space="0" w:color="000000"/>
@@ -30452,7 +30718,7 @@
         </w:tc>
         <w:tc>
           <w:tcPr>
-            <w:tcW w:w="1404" w:type="dxa"/>
+            <w:tcW w:w="1408" w:type="dxa"/>
             <w:tcBorders>
               <w:left w:val="single" w:sz="4" w:space="0" w:color="000000"/>
               <w:bottom w:val="single" w:sz="4" w:space="0" w:color="000000"/>
@@ -32558,8 +32824,8 @@
       </w:tblPr>
       <w:tblGrid>
         <w:gridCol w:w="952"/>
-        <w:gridCol w:w="842"/>
-        <w:gridCol w:w="1404"/>
+        <w:gridCol w:w="838"/>
+        <w:gridCol w:w="1408"/>
         <w:gridCol w:w="2497"/>
         <w:gridCol w:w="4277"/>
       </w:tblGrid>
@@ -32602,7 +32868,7 @@
         </w:tc>
         <w:tc>
           <w:tcPr>
-            <w:tcW w:w="842" w:type="dxa"/>
+            <w:tcW w:w="838" w:type="dxa"/>
             <w:tcBorders>
               <w:top w:val="single" w:sz="4" w:space="0" w:color="000000"/>
               <w:left w:val="single" w:sz="4" w:space="0" w:color="000000"/>
@@ -32637,7 +32903,7 @@
         </w:tc>
         <w:tc>
           <w:tcPr>
-            <w:tcW w:w="1404" w:type="dxa"/>
+            <w:tcW w:w="1408" w:type="dxa"/>
             <w:tcBorders>
               <w:top w:val="single" w:sz="4" w:space="0" w:color="000000"/>
               <w:left w:val="single" w:sz="4" w:space="0" w:color="000000"/>
@@ -32770,7 +33036,7 @@
         </w:tc>
         <w:tc>
           <w:tcPr>
-            <w:tcW w:w="842" w:type="dxa"/>
+            <w:tcW w:w="838" w:type="dxa"/>
             <w:tcBorders>
               <w:left w:val="single" w:sz="4" w:space="0" w:color="000000"/>
               <w:bottom w:val="single" w:sz="4" w:space="0" w:color="000000"/>
@@ -32794,7 +33060,7 @@
         </w:tc>
         <w:tc>
           <w:tcPr>
-            <w:tcW w:w="1404" w:type="dxa"/>
+            <w:tcW w:w="1408" w:type="dxa"/>
             <w:tcBorders>
               <w:left w:val="single" w:sz="4" w:space="0" w:color="000000"/>
               <w:bottom w:val="single" w:sz="4" w:space="0" w:color="000000"/>
@@ -33543,6 +33809,116 @@
                 <w:szCs w:val="16"/>
               </w:rPr>
               <w:t>BASH command from the Pi.</w:t>
+            </w:r>
+          </w:p>
+        </w:tc>
+      </w:tr>
+      <w:tr>
+        <w:trPr/>
+        <w:tc>
+          <w:tcPr>
+            <w:tcW w:w="952" w:type="dxa"/>
+            <w:tcBorders>
+              <w:left w:val="single" w:sz="4" w:space="0" w:color="000000"/>
+              <w:bottom w:val="single" w:sz="4" w:space="0" w:color="000000"/>
+            </w:tcBorders>
+          </w:tcPr>
+          <w:p>
+            <w:pPr>
+              <w:pStyle w:val="TableContents"/>
+              <w:widowControl w:val="false"/>
+              <w:rPr/>
+            </w:pPr>
+            <w:r>
+              <w:rPr/>
+              <w:t>8E</w:t>
+            </w:r>
+          </w:p>
+        </w:tc>
+        <w:tc>
+          <w:tcPr>
+            <w:tcW w:w="821" w:type="dxa"/>
+            <w:tcBorders>
+              <w:left w:val="single" w:sz="4" w:space="0" w:color="000000"/>
+              <w:bottom w:val="single" w:sz="4" w:space="0" w:color="000000"/>
+            </w:tcBorders>
+          </w:tcPr>
+          <w:p>
+            <w:pPr>
+              <w:pStyle w:val="TableContents"/>
+              <w:widowControl w:val="false"/>
+              <w:rPr/>
+            </w:pPr>
+            <w:r>
+              <w:rPr/>
+              <w:t>2</w:t>
+            </w:r>
+          </w:p>
+        </w:tc>
+        <w:tc>
+          <w:tcPr>
+            <w:tcW w:w="1425" w:type="dxa"/>
+            <w:tcBorders>
+              <w:left w:val="single" w:sz="4" w:space="0" w:color="000000"/>
+              <w:bottom w:val="single" w:sz="4" w:space="0" w:color="000000"/>
+            </w:tcBorders>
+          </w:tcPr>
+          <w:p>
+            <w:pPr>
+              <w:pStyle w:val="TableContents"/>
+              <w:widowControl w:val="false"/>
+              <w:rPr/>
+            </w:pPr>
+            <w:r>
+              <w:rPr/>
+              <w:t>01</w:t>
+            </w:r>
+          </w:p>
+        </w:tc>
+        <w:tc>
+          <w:tcPr>
+            <w:tcW w:w="2497" w:type="dxa"/>
+            <w:tcBorders>
+              <w:left w:val="single" w:sz="4" w:space="0" w:color="000000"/>
+              <w:bottom w:val="single" w:sz="4" w:space="0" w:color="000000"/>
+            </w:tcBorders>
+          </w:tcPr>
+          <w:p>
+            <w:pPr>
+              <w:pStyle w:val="TableContents"/>
+              <w:widowControl w:val="false"/>
+              <w:rPr/>
+            </w:pPr>
+            <w:r>
+              <w:rPr/>
+              <w:t>60 20</w:t>
+            </w:r>
+          </w:p>
+        </w:tc>
+        <w:tc>
+          <w:tcPr>
+            <w:tcW w:w="4277" w:type="dxa"/>
+            <w:tcBorders>
+              <w:left w:val="single" w:sz="4" w:space="0" w:color="000000"/>
+              <w:bottom w:val="single" w:sz="4" w:space="0" w:color="000000"/>
+              <w:right w:val="single" w:sz="4" w:space="0" w:color="000000"/>
+            </w:tcBorders>
+          </w:tcPr>
+          <w:p>
+            <w:pPr>
+              <w:pStyle w:val="TableContents"/>
+              <w:widowControl w:val="false"/>
+              <w:rPr>
+                <w:sz w:val="16"/>
+                <w:szCs w:val="16"/>
+              </w:rPr>
+            </w:pPr>
+            <w:r>
+              <w:rPr>
+                <w:sz w:val="16"/>
+                <w:szCs w:val="16"/>
+              </w:rPr>
+              <w:t>A request for colors, as defined below.</w:t>
             </w:r>
           </w:p>
         </w:tc>

</xml_diff>

<commit_message>
Backup Camera, Bug Fixes
Rudimentary backup camera support has been added, though I haven't been able to successfully test it.
</commit_message>
<xml_diff>
--- a/AIBus Information.docx
+++ b/AIBus Information.docx
@@ -16554,6 +16554,2021 @@
                 <w:lang w:val="en-US" w:eastAsia="zh-CN" w:bidi="hi-IN"/>
               </w:rPr>
               <w:t>Mute/unmute audio for a nav prompt. If pp!=0, mute.</w:t>
+            </w:r>
+          </w:p>
+        </w:tc>
+      </w:tr>
+    </w:tbl>
+    <w:p>
+      <w:pPr>
+        <w:pStyle w:val="Normal"/>
+        <w:rPr/>
+      </w:pPr>
+      <w:r>
+        <w:rPr/>
+      </w:r>
+    </w:p>
+    <w:p>
+      <w:pPr>
+        <w:pStyle w:val="Normal"/>
+        <w:rPr/>
+      </w:pPr>
+      <w:r>
+        <w:rPr/>
+        <w:t>Camera Messages</w:t>
+      </w:r>
+    </w:p>
+    <w:tbl>
+      <w:tblPr>
+        <w:tblW w:w="5000" w:type="pct"/>
+        <w:jc w:val="left"/>
+        <w:tblInd w:w="-5" w:type="dxa"/>
+        <w:tblLayout w:type="fixed"/>
+        <w:tblCellMar>
+          <w:top w:w="55" w:type="dxa"/>
+          <w:left w:w="55" w:type="dxa"/>
+          <w:bottom w:w="55" w:type="dxa"/>
+          <w:right w:w="55" w:type="dxa"/>
+        </w:tblCellMar>
+      </w:tblPr>
+      <w:tblGrid>
+        <w:gridCol w:w="952"/>
+        <w:gridCol w:w="847"/>
+        <w:gridCol w:w="1399"/>
+        <w:gridCol w:w="2497"/>
+        <w:gridCol w:w="4277"/>
+      </w:tblGrid>
+      <w:tr>
+        <w:trPr/>
+        <w:tc>
+          <w:tcPr>
+            <w:tcW w:w="952" w:type="dxa"/>
+            <w:tcBorders>
+              <w:top w:val="single" w:sz="4" w:space="0" w:color="000000"/>
+              <w:left w:val="single" w:sz="4" w:space="0" w:color="000000"/>
+              <w:bottom w:val="single" w:sz="4" w:space="0" w:color="000000"/>
+            </w:tcBorders>
+          </w:tcPr>
+          <w:p>
+            <w:pPr>
+              <w:pStyle w:val="TableContents"/>
+              <w:widowControl w:val="false"/>
+              <w:numPr>
+                <w:ilvl w:val="0"/>
+                <w:numId w:val="1"/>
+              </w:numPr>
+              <w:rPr>
+                <w:b/>
+                <w:bCs/>
+                <w:sz w:val="22"/>
+                <w:szCs w:val="22"/>
+              </w:rPr>
+            </w:pPr>
+            <w:r>
+              <w:rPr>
+                <w:b/>
+                <w:bCs/>
+                <w:sz w:val="22"/>
+                <w:szCs w:val="22"/>
+              </w:rPr>
+              <w:t>Source</w:t>
+            </w:r>
+          </w:p>
+        </w:tc>
+        <w:tc>
+          <w:tcPr>
+            <w:tcW w:w="847" w:type="dxa"/>
+            <w:tcBorders>
+              <w:top w:val="single" w:sz="4" w:space="0" w:color="000000"/>
+              <w:left w:val="single" w:sz="4" w:space="0" w:color="000000"/>
+              <w:bottom w:val="single" w:sz="4" w:space="0" w:color="000000"/>
+            </w:tcBorders>
+          </w:tcPr>
+          <w:p>
+            <w:pPr>
+              <w:pStyle w:val="TableContents"/>
+              <w:widowControl w:val="false"/>
+              <w:numPr>
+                <w:ilvl w:val="0"/>
+                <w:numId w:val="1"/>
+              </w:numPr>
+              <w:rPr>
+                <w:b/>
+                <w:bCs/>
+                <w:sz w:val="22"/>
+                <w:szCs w:val="22"/>
+              </w:rPr>
+            </w:pPr>
+            <w:r>
+              <w:rPr>
+                <w:b/>
+                <w:bCs/>
+                <w:sz w:val="22"/>
+                <w:szCs w:val="22"/>
+              </w:rPr>
+              <w:t>Length</w:t>
+            </w:r>
+          </w:p>
+        </w:tc>
+        <w:tc>
+          <w:tcPr>
+            <w:tcW w:w="1399" w:type="dxa"/>
+            <w:tcBorders>
+              <w:top w:val="single" w:sz="4" w:space="0" w:color="000000"/>
+              <w:left w:val="single" w:sz="4" w:space="0" w:color="000000"/>
+              <w:bottom w:val="single" w:sz="4" w:space="0" w:color="000000"/>
+            </w:tcBorders>
+          </w:tcPr>
+          <w:p>
+            <w:pPr>
+              <w:pStyle w:val="TableContents"/>
+              <w:widowControl w:val="false"/>
+              <w:numPr>
+                <w:ilvl w:val="0"/>
+                <w:numId w:val="1"/>
+              </w:numPr>
+              <w:rPr>
+                <w:b/>
+                <w:bCs/>
+                <w:sz w:val="22"/>
+                <w:szCs w:val="22"/>
+              </w:rPr>
+            </w:pPr>
+            <w:r>
+              <w:rPr>
+                <w:b/>
+                <w:bCs/>
+                <w:sz w:val="22"/>
+                <w:szCs w:val="22"/>
+              </w:rPr>
+              <w:t>Destination</w:t>
+            </w:r>
+          </w:p>
+        </w:tc>
+        <w:tc>
+          <w:tcPr>
+            <w:tcW w:w="2497" w:type="dxa"/>
+            <w:tcBorders>
+              <w:top w:val="single" w:sz="4" w:space="0" w:color="000000"/>
+              <w:left w:val="single" w:sz="4" w:space="0" w:color="000000"/>
+              <w:bottom w:val="single" w:sz="4" w:space="0" w:color="000000"/>
+            </w:tcBorders>
+          </w:tcPr>
+          <w:p>
+            <w:pPr>
+              <w:pStyle w:val="TableContents"/>
+              <w:widowControl w:val="false"/>
+              <w:numPr>
+                <w:ilvl w:val="0"/>
+                <w:numId w:val="1"/>
+              </w:numPr>
+              <w:rPr>
+                <w:b/>
+                <w:bCs/>
+                <w:sz w:val="22"/>
+                <w:szCs w:val="22"/>
+              </w:rPr>
+            </w:pPr>
+            <w:r>
+              <w:rPr>
+                <w:b/>
+                <w:bCs/>
+                <w:sz w:val="22"/>
+                <w:szCs w:val="22"/>
+              </w:rPr>
+              <w:t>Data Example</w:t>
+            </w:r>
+          </w:p>
+        </w:tc>
+        <w:tc>
+          <w:tcPr>
+            <w:tcW w:w="4277" w:type="dxa"/>
+            <w:tcBorders>
+              <w:top w:val="single" w:sz="4" w:space="0" w:color="000000"/>
+              <w:left w:val="single" w:sz="4" w:space="0" w:color="000000"/>
+              <w:bottom w:val="single" w:sz="4" w:space="0" w:color="000000"/>
+              <w:right w:val="single" w:sz="4" w:space="0" w:color="000000"/>
+            </w:tcBorders>
+          </w:tcPr>
+          <w:p>
+            <w:pPr>
+              <w:pStyle w:val="TableContents"/>
+              <w:widowControl w:val="false"/>
+              <w:numPr>
+                <w:ilvl w:val="0"/>
+                <w:numId w:val="1"/>
+              </w:numPr>
+              <w:rPr>
+                <w:b/>
+                <w:bCs/>
+                <w:sz w:val="22"/>
+                <w:szCs w:val="22"/>
+              </w:rPr>
+            </w:pPr>
+            <w:r>
+              <w:rPr>
+                <w:b/>
+                <w:bCs/>
+                <w:sz w:val="22"/>
+                <w:szCs w:val="22"/>
+              </w:rPr>
+              <w:t>Interpretation</w:t>
+            </w:r>
+          </w:p>
+        </w:tc>
+      </w:tr>
+      <w:tr>
+        <w:trPr/>
+        <w:tc>
+          <w:tcPr>
+            <w:tcW w:w="952" w:type="dxa"/>
+            <w:tcBorders>
+              <w:left w:val="single" w:sz="4" w:space="0" w:color="000000"/>
+              <w:bottom w:val="single" w:sz="4" w:space="0" w:color="000000"/>
+            </w:tcBorders>
+          </w:tcPr>
+          <w:p>
+            <w:pPr>
+              <w:pStyle w:val="TableContents"/>
+              <w:widowControl w:val="false"/>
+              <w:numPr>
+                <w:ilvl w:val="0"/>
+                <w:numId w:val="1"/>
+              </w:numPr>
+              <w:rPr>
+                <w:b w:val="false"/>
+                <w:bCs w:val="false"/>
+                <w:sz w:val="22"/>
+                <w:szCs w:val="22"/>
+              </w:rPr>
+            </w:pPr>
+            <w:r>
+              <w:rPr>
+                <w:b w:val="false"/>
+                <w:bCs w:val="false"/>
+                <w:sz w:val="22"/>
+                <w:szCs w:val="22"/>
+              </w:rPr>
+              <w:t>57, 1</w:t>
+            </w:r>
+          </w:p>
+        </w:tc>
+        <w:tc>
+          <w:tcPr>
+            <w:tcW w:w="847" w:type="dxa"/>
+            <w:tcBorders>
+              <w:left w:val="single" w:sz="4" w:space="0" w:color="000000"/>
+              <w:bottom w:val="single" w:sz="4" w:space="0" w:color="000000"/>
+            </w:tcBorders>
+          </w:tcPr>
+          <w:p>
+            <w:pPr>
+              <w:pStyle w:val="TableContents"/>
+              <w:widowControl w:val="false"/>
+              <w:numPr>
+                <w:ilvl w:val="0"/>
+                <w:numId w:val="1"/>
+              </w:numPr>
+              <w:rPr>
+                <w:b w:val="false"/>
+                <w:bCs w:val="false"/>
+                <w:sz w:val="22"/>
+                <w:szCs w:val="22"/>
+              </w:rPr>
+            </w:pPr>
+            <w:r>
+              <w:rPr>
+                <w:b w:val="false"/>
+                <w:bCs w:val="false"/>
+                <w:sz w:val="22"/>
+                <w:szCs w:val="22"/>
+              </w:rPr>
+              <w:t>3</w:t>
+            </w:r>
+          </w:p>
+        </w:tc>
+        <w:tc>
+          <w:tcPr>
+            <w:tcW w:w="1399" w:type="dxa"/>
+            <w:tcBorders>
+              <w:left w:val="single" w:sz="4" w:space="0" w:color="000000"/>
+              <w:bottom w:val="single" w:sz="4" w:space="0" w:color="000000"/>
+            </w:tcBorders>
+          </w:tcPr>
+          <w:p>
+            <w:pPr>
+              <w:pStyle w:val="TableContents"/>
+              <w:widowControl w:val="false"/>
+              <w:numPr>
+                <w:ilvl w:val="0"/>
+                <w:numId w:val="1"/>
+              </w:numPr>
+              <w:rPr>
+                <w:b w:val="false"/>
+                <w:bCs w:val="false"/>
+                <w:sz w:val="22"/>
+                <w:szCs w:val="22"/>
+              </w:rPr>
+            </w:pPr>
+            <w:r>
+              <w:rPr>
+                <w:b w:val="false"/>
+                <w:bCs w:val="false"/>
+                <w:sz w:val="22"/>
+                <w:szCs w:val="22"/>
+              </w:rPr>
+              <w:t>61</w:t>
+            </w:r>
+          </w:p>
+        </w:tc>
+        <w:tc>
+          <w:tcPr>
+            <w:tcW w:w="2497" w:type="dxa"/>
+            <w:tcBorders>
+              <w:left w:val="single" w:sz="4" w:space="0" w:color="000000"/>
+              <w:bottom w:val="single" w:sz="4" w:space="0" w:color="000000"/>
+            </w:tcBorders>
+          </w:tcPr>
+          <w:p>
+            <w:pPr>
+              <w:pStyle w:val="TableContents"/>
+              <w:widowControl w:val="false"/>
+              <w:numPr>
+                <w:ilvl w:val="0"/>
+                <w:numId w:val="1"/>
+              </w:numPr>
+              <w:rPr>
+                <w:b w:val="false"/>
+                <w:bCs w:val="false"/>
+                <w:sz w:val="22"/>
+                <w:szCs w:val="22"/>
+              </w:rPr>
+            </w:pPr>
+            <w:r>
+              <w:rPr>
+                <w:b w:val="false"/>
+                <w:bCs w:val="false"/>
+                <w:sz w:val="22"/>
+                <w:szCs w:val="22"/>
+              </w:rPr>
+              <w:t>48 61 nn</w:t>
+            </w:r>
+          </w:p>
+        </w:tc>
+        <w:tc>
+          <w:tcPr>
+            <w:tcW w:w="4277" w:type="dxa"/>
+            <w:tcBorders>
+              <w:left w:val="single" w:sz="4" w:space="0" w:color="000000"/>
+              <w:bottom w:val="single" w:sz="4" w:space="0" w:color="000000"/>
+              <w:right w:val="single" w:sz="4" w:space="0" w:color="000000"/>
+            </w:tcBorders>
+          </w:tcPr>
+          <w:p>
+            <w:pPr>
+              <w:pStyle w:val="TableContents"/>
+              <w:widowControl w:val="false"/>
+              <w:numPr>
+                <w:ilvl w:val="0"/>
+                <w:numId w:val="1"/>
+              </w:numPr>
+              <w:rPr>
+                <w:rFonts w:ascii="Arial" w:hAnsi="Arial" w:eastAsia="Noto Serif CJK SC" w:cs="Mangal"/>
+                <w:color w:val="auto"/>
+                <w:kern w:val="2"/>
+                <w:sz w:val="16"/>
+                <w:szCs w:val="16"/>
+                <w:lang w:val="en-US" w:eastAsia="zh-CN" w:bidi="hi-IN"/>
+              </w:rPr>
+            </w:pPr>
+            <w:r>
+              <w:rPr>
+                <w:rFonts w:eastAsia="Noto Serif CJK SC" w:cs="Mangal"/>
+                <w:color w:val="auto"/>
+                <w:kern w:val="2"/>
+                <w:sz w:val="16"/>
+                <w:szCs w:val="16"/>
+                <w:lang w:val="en-US" w:eastAsia="zh-CN" w:bidi="hi-IN"/>
+              </w:rPr>
+              <w:t>Turn the camera on/off, off if nn==0. Otherwise the number determines which camera to use if multiple are present. This message can be sent by 61 to switch the nav system to display the camera.</w:t>
+            </w:r>
+          </w:p>
+        </w:tc>
+      </w:tr>
+      <w:tr>
+        <w:trPr/>
+        <w:tc>
+          <w:tcPr>
+            <w:tcW w:w="952" w:type="dxa"/>
+            <w:tcBorders>
+              <w:left w:val="single" w:sz="4" w:space="0" w:color="000000"/>
+              <w:bottom w:val="single" w:sz="4" w:space="0" w:color="000000"/>
+            </w:tcBorders>
+          </w:tcPr>
+          <w:p>
+            <w:pPr>
+              <w:pStyle w:val="TableContents"/>
+              <w:widowControl w:val="false"/>
+              <w:numPr>
+                <w:ilvl w:val="0"/>
+                <w:numId w:val="1"/>
+              </w:numPr>
+              <w:rPr>
+                <w:b w:val="false"/>
+                <w:bCs w:val="false"/>
+                <w:sz w:val="22"/>
+                <w:szCs w:val="22"/>
+              </w:rPr>
+            </w:pPr>
+            <w:r>
+              <w:rPr>
+                <w:b w:val="false"/>
+                <w:bCs w:val="false"/>
+                <w:sz w:val="22"/>
+                <w:szCs w:val="22"/>
+              </w:rPr>
+              <w:t>61</w:t>
+            </w:r>
+          </w:p>
+        </w:tc>
+        <w:tc>
+          <w:tcPr>
+            <w:tcW w:w="847" w:type="dxa"/>
+            <w:tcBorders>
+              <w:left w:val="single" w:sz="4" w:space="0" w:color="000000"/>
+              <w:bottom w:val="single" w:sz="4" w:space="0" w:color="000000"/>
+            </w:tcBorders>
+          </w:tcPr>
+          <w:p>
+            <w:pPr>
+              <w:pStyle w:val="TableContents"/>
+              <w:widowControl w:val="false"/>
+              <w:numPr>
+                <w:ilvl w:val="0"/>
+                <w:numId w:val="1"/>
+              </w:numPr>
+              <w:rPr>
+                <w:b w:val="false"/>
+                <w:bCs w:val="false"/>
+                <w:sz w:val="22"/>
+                <w:szCs w:val="22"/>
+              </w:rPr>
+            </w:pPr>
+            <w:r>
+              <w:rPr>
+                <w:b w:val="false"/>
+                <w:bCs w:val="false"/>
+                <w:sz w:val="22"/>
+                <w:szCs w:val="22"/>
+              </w:rPr>
+              <w:t>Varies</w:t>
+            </w:r>
+          </w:p>
+        </w:tc>
+        <w:tc>
+          <w:tcPr>
+            <w:tcW w:w="1399" w:type="dxa"/>
+            <w:tcBorders>
+              <w:left w:val="single" w:sz="4" w:space="0" w:color="000000"/>
+              <w:bottom w:val="single" w:sz="4" w:space="0" w:color="000000"/>
+            </w:tcBorders>
+          </w:tcPr>
+          <w:p>
+            <w:pPr>
+              <w:pStyle w:val="TableContents"/>
+              <w:widowControl w:val="false"/>
+              <w:numPr>
+                <w:ilvl w:val="0"/>
+                <w:numId w:val="1"/>
+              </w:numPr>
+              <w:rPr>
+                <w:b w:val="false"/>
+                <w:bCs w:val="false"/>
+                <w:sz w:val="22"/>
+                <w:szCs w:val="22"/>
+              </w:rPr>
+            </w:pPr>
+            <w:r>
+              <w:rPr>
+                <w:b w:val="false"/>
+                <w:bCs w:val="false"/>
+                <w:sz w:val="22"/>
+                <w:szCs w:val="22"/>
+              </w:rPr>
+              <w:t>1, 57</w:t>
+            </w:r>
+          </w:p>
+        </w:tc>
+        <w:tc>
+          <w:tcPr>
+            <w:tcW w:w="2497" w:type="dxa"/>
+            <w:tcBorders>
+              <w:left w:val="single" w:sz="4" w:space="0" w:color="000000"/>
+              <w:bottom w:val="single" w:sz="4" w:space="0" w:color="000000"/>
+            </w:tcBorders>
+          </w:tcPr>
+          <w:p>
+            <w:pPr>
+              <w:pStyle w:val="TableContents"/>
+              <w:widowControl w:val="false"/>
+              <w:numPr>
+                <w:ilvl w:val="0"/>
+                <w:numId w:val="1"/>
+              </w:numPr>
+              <w:rPr>
+                <w:b w:val="false"/>
+                <w:bCs w:val="false"/>
+                <w:sz w:val="22"/>
+                <w:szCs w:val="22"/>
+              </w:rPr>
+            </w:pPr>
+            <w:r>
+              <w:rPr>
+                <w:b w:val="false"/>
+                <w:bCs w:val="false"/>
+                <w:sz w:val="22"/>
+                <w:szCs w:val="22"/>
+              </w:rPr>
+              <w:t>2C 3B […]</w:t>
+            </w:r>
+          </w:p>
+        </w:tc>
+        <w:tc>
+          <w:tcPr>
+            <w:tcW w:w="4277" w:type="dxa"/>
+            <w:tcBorders>
+              <w:left w:val="single" w:sz="4" w:space="0" w:color="000000"/>
+              <w:bottom w:val="single" w:sz="4" w:space="0" w:color="000000"/>
+              <w:right w:val="single" w:sz="4" w:space="0" w:color="000000"/>
+            </w:tcBorders>
+          </w:tcPr>
+          <w:p>
+            <w:pPr>
+              <w:pStyle w:val="TableContents"/>
+              <w:widowControl w:val="false"/>
+              <w:numPr>
+                <w:ilvl w:val="0"/>
+                <w:numId w:val="1"/>
+              </w:numPr>
+              <w:rPr>
+                <w:rFonts w:ascii="Arial" w:hAnsi="Arial" w:eastAsia="Noto Serif CJK SC" w:cs="Mangal"/>
+                <w:color w:val="auto"/>
+                <w:kern w:val="2"/>
+                <w:sz w:val="16"/>
+                <w:szCs w:val="16"/>
+                <w:lang w:val="en-US" w:eastAsia="zh-CN" w:bidi="hi-IN"/>
+              </w:rPr>
+            </w:pPr>
+            <w:r>
+              <w:rPr>
+                <w:rFonts w:eastAsia="Noto Serif CJK SC" w:cs="Mangal"/>
+                <w:color w:val="auto"/>
+                <w:kern w:val="2"/>
+                <w:sz w:val="16"/>
+                <w:szCs w:val="16"/>
+                <w:lang w:val="en-US" w:eastAsia="zh-CN" w:bidi="hi-IN"/>
+              </w:rPr>
+              <w:t>List of supported cameras/features, defined as follows:</w:t>
+            </w:r>
+          </w:p>
+          <w:p>
+            <w:pPr>
+              <w:pStyle w:val="TableContents"/>
+              <w:widowControl w:val="false"/>
+              <w:numPr>
+                <w:ilvl w:val="0"/>
+                <w:numId w:val="24"/>
+              </w:numPr>
+              <w:suppressLineNumbers/>
+              <w:suppressAutoHyphens w:val="true"/>
+              <w:bidi w:val="0"/>
+              <w:spacing w:before="0" w:after="0"/>
+              <w:ind w:hanging="180" w:left="269" w:right="360"/>
+              <w:jc w:val="left"/>
+              <w:rPr>
+                <w:rFonts w:ascii="Arial" w:hAnsi="Arial" w:eastAsia="Noto Serif CJK SC" w:cs="Mangal"/>
+                <w:color w:val="auto"/>
+                <w:kern w:val="2"/>
+                <w:sz w:val="16"/>
+                <w:szCs w:val="16"/>
+                <w:lang w:val="en-US" w:eastAsia="zh-CN" w:bidi="hi-IN"/>
+              </w:rPr>
+            </w:pPr>
+            <w:r>
+              <w:rPr>
+                <w:rFonts w:eastAsia="Noto Serif CJK SC" w:cs="Mangal"/>
+                <w:color w:val="auto"/>
+                <w:kern w:val="2"/>
+                <w:sz w:val="16"/>
+                <w:szCs w:val="16"/>
+                <w:lang w:val="en-US" w:eastAsia="zh-CN" w:bidi="hi-IN"/>
+              </w:rPr>
+              <w:t>01: Rear View</w:t>
+            </w:r>
+          </w:p>
+          <w:p>
+            <w:pPr>
+              <w:pStyle w:val="TableContents"/>
+              <w:widowControl w:val="false"/>
+              <w:numPr>
+                <w:ilvl w:val="0"/>
+                <w:numId w:val="24"/>
+              </w:numPr>
+              <w:suppressLineNumbers/>
+              <w:suppressAutoHyphens w:val="true"/>
+              <w:bidi w:val="0"/>
+              <w:spacing w:before="0" w:after="0"/>
+              <w:ind w:hanging="180" w:left="269" w:right="360"/>
+              <w:jc w:val="left"/>
+              <w:rPr>
+                <w:rFonts w:ascii="Arial" w:hAnsi="Arial" w:eastAsia="Noto Serif CJK SC" w:cs="Mangal"/>
+                <w:color w:val="auto"/>
+                <w:kern w:val="2"/>
+                <w:sz w:val="16"/>
+                <w:szCs w:val="16"/>
+                <w:lang w:val="en-US" w:eastAsia="zh-CN" w:bidi="hi-IN"/>
+              </w:rPr>
+            </w:pPr>
+            <w:r>
+              <w:rPr>
+                <w:rFonts w:eastAsia="Noto Serif CJK SC" w:cs="Mangal"/>
+                <w:color w:val="auto"/>
+                <w:kern w:val="2"/>
+                <w:sz w:val="16"/>
+                <w:szCs w:val="16"/>
+                <w:lang w:val="en-US" w:eastAsia="zh-CN" w:bidi="hi-IN"/>
+              </w:rPr>
+              <w:t>02: Left Side View</w:t>
+            </w:r>
+          </w:p>
+          <w:p>
+            <w:pPr>
+              <w:pStyle w:val="TableContents"/>
+              <w:widowControl w:val="false"/>
+              <w:numPr>
+                <w:ilvl w:val="0"/>
+                <w:numId w:val="24"/>
+              </w:numPr>
+              <w:suppressLineNumbers/>
+              <w:suppressAutoHyphens w:val="true"/>
+              <w:bidi w:val="0"/>
+              <w:spacing w:before="0" w:after="0"/>
+              <w:ind w:hanging="180" w:left="269" w:right="360"/>
+              <w:jc w:val="left"/>
+              <w:rPr>
+                <w:rFonts w:ascii="Arial" w:hAnsi="Arial" w:eastAsia="Noto Serif CJK SC" w:cs="Mangal"/>
+                <w:color w:val="auto"/>
+                <w:kern w:val="2"/>
+                <w:sz w:val="16"/>
+                <w:szCs w:val="16"/>
+                <w:lang w:val="en-US" w:eastAsia="zh-CN" w:bidi="hi-IN"/>
+              </w:rPr>
+            </w:pPr>
+            <w:r>
+              <w:rPr>
+                <w:rFonts w:eastAsia="Noto Serif CJK SC" w:cs="Mangal"/>
+                <w:color w:val="auto"/>
+                <w:kern w:val="2"/>
+                <w:sz w:val="16"/>
+                <w:szCs w:val="16"/>
+                <w:lang w:val="en-US" w:eastAsia="zh-CN" w:bidi="hi-IN"/>
+              </w:rPr>
+              <w:t>03: Right Side View</w:t>
+            </w:r>
+          </w:p>
+          <w:p>
+            <w:pPr>
+              <w:pStyle w:val="TableContents"/>
+              <w:widowControl w:val="false"/>
+              <w:numPr>
+                <w:ilvl w:val="0"/>
+                <w:numId w:val="24"/>
+              </w:numPr>
+              <w:suppressLineNumbers/>
+              <w:suppressAutoHyphens w:val="true"/>
+              <w:bidi w:val="0"/>
+              <w:spacing w:before="0" w:after="0"/>
+              <w:ind w:hanging="180" w:left="269" w:right="360"/>
+              <w:jc w:val="left"/>
+              <w:rPr>
+                <w:rFonts w:ascii="Arial" w:hAnsi="Arial" w:eastAsia="Noto Serif CJK SC" w:cs="Mangal"/>
+                <w:color w:val="auto"/>
+                <w:kern w:val="2"/>
+                <w:sz w:val="16"/>
+                <w:szCs w:val="16"/>
+                <w:lang w:val="en-US" w:eastAsia="zh-CN" w:bidi="hi-IN"/>
+              </w:rPr>
+            </w:pPr>
+            <w:r>
+              <w:rPr>
+                <w:rFonts w:eastAsia="Noto Serif CJK SC" w:cs="Mangal"/>
+                <w:color w:val="auto"/>
+                <w:kern w:val="2"/>
+                <w:sz w:val="16"/>
+                <w:szCs w:val="16"/>
+                <w:lang w:val="en-US" w:eastAsia="zh-CN" w:bidi="hi-IN"/>
+              </w:rPr>
+              <w:t>04: Front View</w:t>
+            </w:r>
+          </w:p>
+          <w:p>
+            <w:pPr>
+              <w:pStyle w:val="TableContents"/>
+              <w:widowControl w:val="false"/>
+              <w:numPr>
+                <w:ilvl w:val="0"/>
+                <w:numId w:val="24"/>
+              </w:numPr>
+              <w:suppressLineNumbers/>
+              <w:suppressAutoHyphens w:val="true"/>
+              <w:bidi w:val="0"/>
+              <w:spacing w:before="0" w:after="0"/>
+              <w:ind w:hanging="180" w:left="269" w:right="360"/>
+              <w:jc w:val="left"/>
+              <w:rPr>
+                <w:rFonts w:ascii="Arial" w:hAnsi="Arial" w:eastAsia="Noto Serif CJK SC" w:cs="Mangal"/>
+                <w:color w:val="auto"/>
+                <w:kern w:val="2"/>
+                <w:sz w:val="16"/>
+                <w:szCs w:val="16"/>
+                <w:lang w:val="en-US" w:eastAsia="zh-CN" w:bidi="hi-IN"/>
+              </w:rPr>
+            </w:pPr>
+            <w:r>
+              <w:rPr>
+                <w:rFonts w:eastAsia="Noto Serif CJK SC" w:cs="Mangal"/>
+                <w:color w:val="auto"/>
+                <w:kern w:val="2"/>
+                <w:sz w:val="16"/>
+                <w:szCs w:val="16"/>
+                <w:lang w:val="en-US" w:eastAsia="zh-CN" w:bidi="hi-IN"/>
+              </w:rPr>
+              <w:t>05: Rear View Zoomed</w:t>
+            </w:r>
+          </w:p>
+          <w:p>
+            <w:pPr>
+              <w:pStyle w:val="TableContents"/>
+              <w:widowControl w:val="false"/>
+              <w:numPr>
+                <w:ilvl w:val="0"/>
+                <w:numId w:val="24"/>
+              </w:numPr>
+              <w:suppressLineNumbers/>
+              <w:suppressAutoHyphens w:val="true"/>
+              <w:bidi w:val="0"/>
+              <w:spacing w:before="0" w:after="0"/>
+              <w:ind w:hanging="180" w:left="269" w:right="360"/>
+              <w:jc w:val="left"/>
+              <w:rPr>
+                <w:rFonts w:ascii="Arial" w:hAnsi="Arial" w:eastAsia="Noto Serif CJK SC" w:cs="Mangal"/>
+                <w:color w:val="auto"/>
+                <w:kern w:val="2"/>
+                <w:sz w:val="16"/>
+                <w:szCs w:val="16"/>
+                <w:lang w:val="en-US" w:eastAsia="zh-CN" w:bidi="hi-IN"/>
+              </w:rPr>
+            </w:pPr>
+            <w:r>
+              <w:rPr>
+                <w:rFonts w:eastAsia="Noto Serif CJK SC" w:cs="Mangal"/>
+                <w:color w:val="auto"/>
+                <w:kern w:val="2"/>
+                <w:sz w:val="16"/>
+                <w:szCs w:val="16"/>
+                <w:lang w:val="en-US" w:eastAsia="zh-CN" w:bidi="hi-IN"/>
+              </w:rPr>
+              <w:t>06: Rear Panoramic</w:t>
+            </w:r>
+          </w:p>
+          <w:p>
+            <w:pPr>
+              <w:pStyle w:val="TableContents"/>
+              <w:widowControl w:val="false"/>
+              <w:numPr>
+                <w:ilvl w:val="0"/>
+                <w:numId w:val="24"/>
+              </w:numPr>
+              <w:suppressLineNumbers/>
+              <w:suppressAutoHyphens w:val="true"/>
+              <w:bidi w:val="0"/>
+              <w:spacing w:before="0" w:after="0"/>
+              <w:ind w:hanging="180" w:left="269" w:right="360"/>
+              <w:jc w:val="left"/>
+              <w:rPr>
+                <w:rFonts w:ascii="Arial" w:hAnsi="Arial" w:eastAsia="Noto Serif CJK SC" w:cs="Mangal"/>
+                <w:color w:val="auto"/>
+                <w:kern w:val="2"/>
+                <w:sz w:val="16"/>
+                <w:szCs w:val="16"/>
+                <w:lang w:val="en-US" w:eastAsia="zh-CN" w:bidi="hi-IN"/>
+              </w:rPr>
+            </w:pPr>
+            <w:r>
+              <w:rPr>
+                <w:rFonts w:eastAsia="Noto Serif CJK SC" w:cs="Mangal"/>
+                <w:color w:val="auto"/>
+                <w:kern w:val="2"/>
+                <w:sz w:val="16"/>
+                <w:szCs w:val="16"/>
+                <w:lang w:val="en-US" w:eastAsia="zh-CN" w:bidi="hi-IN"/>
+              </w:rPr>
+              <w:t>07: 360</w:t>
+            </w:r>
+            <w:r>
+              <w:rPr>
+                <w:rFonts w:eastAsia="Noto Serif CJK SC" w:cs="Mangal"/>
+                <w:color w:val="auto"/>
+                <w:kern w:val="2"/>
+                <w:sz w:val="16"/>
+                <w:szCs w:val="16"/>
+                <w:lang w:val="en-US" w:eastAsia="zh-CN" w:bidi="hi-IN"/>
+              </w:rPr>
+              <w:t>°</w:t>
+            </w:r>
+            <w:r>
+              <w:rPr>
+                <w:rFonts w:eastAsia="Noto Serif CJK SC" w:cs="Mangal"/>
+                <w:color w:val="auto"/>
+                <w:kern w:val="2"/>
+                <w:sz w:val="16"/>
+                <w:szCs w:val="16"/>
+                <w:lang w:val="en-US" w:eastAsia="zh-CN" w:bidi="hi-IN"/>
+              </w:rPr>
+              <w:t xml:space="preserve"> from Top</w:t>
+            </w:r>
+          </w:p>
+          <w:p>
+            <w:pPr>
+              <w:pStyle w:val="TableContents"/>
+              <w:widowControl w:val="false"/>
+              <w:numPr>
+                <w:ilvl w:val="0"/>
+                <w:numId w:val="24"/>
+              </w:numPr>
+              <w:suppressLineNumbers/>
+              <w:suppressAutoHyphens w:val="true"/>
+              <w:bidi w:val="0"/>
+              <w:spacing w:before="0" w:after="0"/>
+              <w:ind w:hanging="180" w:left="269" w:right="360"/>
+              <w:jc w:val="left"/>
+              <w:rPr>
+                <w:rFonts w:ascii="Arial" w:hAnsi="Arial" w:eastAsia="Noto Serif CJK SC" w:cs="Mangal"/>
+                <w:color w:val="auto"/>
+                <w:kern w:val="2"/>
+                <w:sz w:val="16"/>
+                <w:szCs w:val="16"/>
+                <w:lang w:val="en-US" w:eastAsia="zh-CN" w:bidi="hi-IN"/>
+              </w:rPr>
+            </w:pPr>
+            <w:r>
+              <w:rPr>
+                <w:rFonts w:eastAsia="Noto Serif CJK SC" w:cs="Mangal"/>
+                <w:color w:val="auto"/>
+                <w:kern w:val="2"/>
+                <w:sz w:val="16"/>
+                <w:szCs w:val="16"/>
+                <w:lang w:val="en-US" w:eastAsia="zh-CN" w:bidi="hi-IN"/>
+              </w:rPr>
+              <w:t>08: Bed (truck)</w:t>
+            </w:r>
+          </w:p>
+          <w:p>
+            <w:pPr>
+              <w:pStyle w:val="TableContents"/>
+              <w:widowControl w:val="false"/>
+              <w:numPr>
+                <w:ilvl w:val="0"/>
+                <w:numId w:val="24"/>
+              </w:numPr>
+              <w:suppressLineNumbers/>
+              <w:suppressAutoHyphens w:val="true"/>
+              <w:bidi w:val="0"/>
+              <w:spacing w:before="0" w:after="0"/>
+              <w:ind w:hanging="180" w:left="269" w:right="360"/>
+              <w:jc w:val="left"/>
+              <w:rPr>
+                <w:rFonts w:ascii="Arial" w:hAnsi="Arial" w:eastAsia="Noto Serif CJK SC" w:cs="Mangal"/>
+                <w:color w:val="auto"/>
+                <w:kern w:val="2"/>
+                <w:sz w:val="16"/>
+                <w:szCs w:val="16"/>
+                <w:lang w:val="en-US" w:eastAsia="zh-CN" w:bidi="hi-IN"/>
+              </w:rPr>
+            </w:pPr>
+            <w:r>
+              <w:rPr>
+                <w:rFonts w:eastAsia="Noto Serif CJK SC" w:cs="Mangal"/>
+                <w:color w:val="auto"/>
+                <w:kern w:val="2"/>
+                <w:sz w:val="16"/>
+                <w:szCs w:val="16"/>
+                <w:lang w:val="en-US" w:eastAsia="zh-CN" w:bidi="hi-IN"/>
+              </w:rPr>
+              <w:t>80: Trajectory</w:t>
+            </w:r>
+          </w:p>
+          <w:p>
+            <w:pPr>
+              <w:pStyle w:val="TableContents"/>
+              <w:widowControl w:val="false"/>
+              <w:numPr>
+                <w:ilvl w:val="0"/>
+                <w:numId w:val="24"/>
+              </w:numPr>
+              <w:suppressLineNumbers/>
+              <w:suppressAutoHyphens w:val="true"/>
+              <w:bidi w:val="0"/>
+              <w:spacing w:before="0" w:after="0"/>
+              <w:ind w:hanging="180" w:left="269" w:right="360"/>
+              <w:jc w:val="left"/>
+              <w:rPr>
+                <w:rFonts w:ascii="Arial" w:hAnsi="Arial" w:eastAsia="Noto Serif CJK SC" w:cs="Mangal"/>
+                <w:color w:val="auto"/>
+                <w:kern w:val="2"/>
+                <w:sz w:val="16"/>
+                <w:szCs w:val="16"/>
+                <w:lang w:val="en-US" w:eastAsia="zh-CN" w:bidi="hi-IN"/>
+              </w:rPr>
+            </w:pPr>
+            <w:r>
+              <w:rPr>
+                <w:rFonts w:eastAsia="Noto Serif CJK SC" w:cs="Mangal"/>
+                <w:color w:val="auto"/>
+                <w:kern w:val="2"/>
+                <w:sz w:val="16"/>
+                <w:szCs w:val="16"/>
+                <w:lang w:val="en-US" w:eastAsia="zh-CN" w:bidi="hi-IN"/>
+              </w:rPr>
+              <w:t>81: Distance Markers</w:t>
+            </w:r>
+          </w:p>
+        </w:tc>
+      </w:tr>
+      <w:tr>
+        <w:trPr/>
+        <w:tc>
+          <w:tcPr>
+            <w:tcW w:w="952" w:type="dxa"/>
+            <w:tcBorders>
+              <w:left w:val="single" w:sz="4" w:space="0" w:color="000000"/>
+              <w:bottom w:val="single" w:sz="4" w:space="0" w:color="000000"/>
+            </w:tcBorders>
+          </w:tcPr>
+          <w:p>
+            <w:pPr>
+              <w:pStyle w:val="TableContents"/>
+              <w:widowControl w:val="false"/>
+              <w:numPr>
+                <w:ilvl w:val="0"/>
+                <w:numId w:val="1"/>
+              </w:numPr>
+              <w:rPr>
+                <w:b w:val="false"/>
+                <w:bCs w:val="false"/>
+                <w:sz w:val="22"/>
+                <w:szCs w:val="22"/>
+              </w:rPr>
+            </w:pPr>
+            <w:r>
+              <w:rPr>
+                <w:b w:val="false"/>
+                <w:bCs w:val="false"/>
+                <w:sz w:val="22"/>
+                <w:szCs w:val="22"/>
+              </w:rPr>
+              <w:t>Any</w:t>
+            </w:r>
+          </w:p>
+        </w:tc>
+        <w:tc>
+          <w:tcPr>
+            <w:tcW w:w="847" w:type="dxa"/>
+            <w:tcBorders>
+              <w:left w:val="single" w:sz="4" w:space="0" w:color="000000"/>
+              <w:bottom w:val="single" w:sz="4" w:space="0" w:color="000000"/>
+            </w:tcBorders>
+          </w:tcPr>
+          <w:p>
+            <w:pPr>
+              <w:pStyle w:val="TableContents"/>
+              <w:widowControl w:val="false"/>
+              <w:numPr>
+                <w:ilvl w:val="0"/>
+                <w:numId w:val="1"/>
+              </w:numPr>
+              <w:rPr>
+                <w:b w:val="false"/>
+                <w:bCs w:val="false"/>
+                <w:sz w:val="22"/>
+                <w:szCs w:val="22"/>
+              </w:rPr>
+            </w:pPr>
+            <w:r>
+              <w:rPr>
+                <w:b w:val="false"/>
+                <w:bCs w:val="false"/>
+                <w:sz w:val="22"/>
+                <w:szCs w:val="22"/>
+              </w:rPr>
+              <w:t>2</w:t>
+            </w:r>
+          </w:p>
+        </w:tc>
+        <w:tc>
+          <w:tcPr>
+            <w:tcW w:w="1399" w:type="dxa"/>
+            <w:tcBorders>
+              <w:left w:val="single" w:sz="4" w:space="0" w:color="000000"/>
+              <w:bottom w:val="single" w:sz="4" w:space="0" w:color="000000"/>
+            </w:tcBorders>
+          </w:tcPr>
+          <w:p>
+            <w:pPr>
+              <w:pStyle w:val="TableContents"/>
+              <w:widowControl w:val="false"/>
+              <w:numPr>
+                <w:ilvl w:val="0"/>
+                <w:numId w:val="1"/>
+              </w:numPr>
+              <w:rPr>
+                <w:b w:val="false"/>
+                <w:bCs w:val="false"/>
+                <w:sz w:val="22"/>
+                <w:szCs w:val="22"/>
+              </w:rPr>
+            </w:pPr>
+            <w:r>
+              <w:rPr>
+                <w:b w:val="false"/>
+                <w:bCs w:val="false"/>
+                <w:sz w:val="22"/>
+                <w:szCs w:val="22"/>
+              </w:rPr>
+              <w:t>61</w:t>
+            </w:r>
+          </w:p>
+        </w:tc>
+        <w:tc>
+          <w:tcPr>
+            <w:tcW w:w="2497" w:type="dxa"/>
+            <w:tcBorders>
+              <w:left w:val="single" w:sz="4" w:space="0" w:color="000000"/>
+              <w:bottom w:val="single" w:sz="4" w:space="0" w:color="000000"/>
+            </w:tcBorders>
+          </w:tcPr>
+          <w:p>
+            <w:pPr>
+              <w:pStyle w:val="TableContents"/>
+              <w:widowControl w:val="false"/>
+              <w:numPr>
+                <w:ilvl w:val="0"/>
+                <w:numId w:val="1"/>
+              </w:numPr>
+              <w:rPr>
+                <w:b w:val="false"/>
+                <w:bCs w:val="false"/>
+                <w:sz w:val="22"/>
+                <w:szCs w:val="22"/>
+              </w:rPr>
+            </w:pPr>
+            <w:r>
+              <w:rPr>
+                <w:b w:val="false"/>
+                <w:bCs w:val="false"/>
+                <w:sz w:val="22"/>
+                <w:szCs w:val="22"/>
+              </w:rPr>
+              <w:t>2C F0</w:t>
+            </w:r>
+          </w:p>
+        </w:tc>
+        <w:tc>
+          <w:tcPr>
+            <w:tcW w:w="4277" w:type="dxa"/>
+            <w:tcBorders>
+              <w:left w:val="single" w:sz="4" w:space="0" w:color="000000"/>
+              <w:bottom w:val="single" w:sz="4" w:space="0" w:color="000000"/>
+              <w:right w:val="single" w:sz="4" w:space="0" w:color="000000"/>
+            </w:tcBorders>
+          </w:tcPr>
+          <w:p>
+            <w:pPr>
+              <w:pStyle w:val="TableContents"/>
+              <w:widowControl w:val="false"/>
+              <w:numPr>
+                <w:ilvl w:val="0"/>
+                <w:numId w:val="1"/>
+              </w:numPr>
+              <w:rPr>
+                <w:rFonts w:ascii="Arial" w:hAnsi="Arial" w:eastAsia="Noto Serif CJK SC" w:cs="Mangal"/>
+                <w:color w:val="auto"/>
+                <w:kern w:val="2"/>
+                <w:sz w:val="16"/>
+                <w:szCs w:val="16"/>
+                <w:lang w:val="en-US" w:eastAsia="zh-CN" w:bidi="hi-IN"/>
+              </w:rPr>
+            </w:pPr>
+            <w:r>
+              <w:rPr>
+                <w:rFonts w:eastAsia="Noto Serif CJK SC" w:cs="Mangal"/>
+                <w:color w:val="auto"/>
+                <w:kern w:val="2"/>
+                <w:sz w:val="16"/>
+                <w:szCs w:val="16"/>
+                <w:lang w:val="en-US" w:eastAsia="zh-CN" w:bidi="hi-IN"/>
+              </w:rPr>
+              <w:t>Request for supported cameras and features.</w:t>
+            </w:r>
+          </w:p>
+        </w:tc>
+      </w:tr>
+      <w:tr>
+        <w:trPr/>
+        <w:tc>
+          <w:tcPr>
+            <w:tcW w:w="952" w:type="dxa"/>
+            <w:tcBorders>
+              <w:left w:val="single" w:sz="4" w:space="0" w:color="000000"/>
+              <w:bottom w:val="single" w:sz="4" w:space="0" w:color="000000"/>
+            </w:tcBorders>
+          </w:tcPr>
+          <w:p>
+            <w:pPr>
+              <w:pStyle w:val="TableContents"/>
+              <w:widowControl w:val="false"/>
+              <w:numPr>
+                <w:ilvl w:val="0"/>
+                <w:numId w:val="1"/>
+              </w:numPr>
+              <w:rPr>
+                <w:b w:val="false"/>
+                <w:bCs w:val="false"/>
+                <w:sz w:val="22"/>
+                <w:szCs w:val="22"/>
+              </w:rPr>
+            </w:pPr>
+            <w:r>
+              <w:rPr>
+                <w:b w:val="false"/>
+                <w:bCs w:val="false"/>
+                <w:sz w:val="22"/>
+                <w:szCs w:val="22"/>
+              </w:rPr>
+              <w:t>61</w:t>
+            </w:r>
+          </w:p>
+        </w:tc>
+        <w:tc>
+          <w:tcPr>
+            <w:tcW w:w="847" w:type="dxa"/>
+            <w:tcBorders>
+              <w:left w:val="single" w:sz="4" w:space="0" w:color="000000"/>
+              <w:bottom w:val="single" w:sz="4" w:space="0" w:color="000000"/>
+            </w:tcBorders>
+          </w:tcPr>
+          <w:p>
+            <w:pPr>
+              <w:pStyle w:val="TableContents"/>
+              <w:widowControl w:val="false"/>
+              <w:numPr>
+                <w:ilvl w:val="0"/>
+                <w:numId w:val="1"/>
+              </w:numPr>
+              <w:rPr>
+                <w:b w:val="false"/>
+                <w:bCs w:val="false"/>
+                <w:sz w:val="22"/>
+                <w:szCs w:val="22"/>
+              </w:rPr>
+            </w:pPr>
+            <w:r>
+              <w:rPr>
+                <w:b w:val="false"/>
+                <w:bCs w:val="false"/>
+                <w:sz w:val="22"/>
+                <w:szCs w:val="22"/>
+              </w:rPr>
+              <w:t>Varies</w:t>
+            </w:r>
+          </w:p>
+        </w:tc>
+        <w:tc>
+          <w:tcPr>
+            <w:tcW w:w="1399" w:type="dxa"/>
+            <w:tcBorders>
+              <w:left w:val="single" w:sz="4" w:space="0" w:color="000000"/>
+              <w:bottom w:val="single" w:sz="4" w:space="0" w:color="000000"/>
+            </w:tcBorders>
+          </w:tcPr>
+          <w:p>
+            <w:pPr>
+              <w:pStyle w:val="TableContents"/>
+              <w:widowControl w:val="false"/>
+              <w:numPr>
+                <w:ilvl w:val="0"/>
+                <w:numId w:val="1"/>
+              </w:numPr>
+              <w:rPr>
+                <w:b w:val="false"/>
+                <w:bCs w:val="false"/>
+                <w:sz w:val="22"/>
+                <w:szCs w:val="22"/>
+              </w:rPr>
+            </w:pPr>
+            <w:r>
+              <w:rPr>
+                <w:b w:val="false"/>
+                <w:bCs w:val="false"/>
+                <w:sz w:val="22"/>
+                <w:szCs w:val="22"/>
+              </w:rPr>
+              <w:t>1</w:t>
+            </w:r>
+          </w:p>
+        </w:tc>
+        <w:tc>
+          <w:tcPr>
+            <w:tcW w:w="2497" w:type="dxa"/>
+            <w:tcBorders>
+              <w:left w:val="single" w:sz="4" w:space="0" w:color="000000"/>
+              <w:bottom w:val="single" w:sz="4" w:space="0" w:color="000000"/>
+            </w:tcBorders>
+          </w:tcPr>
+          <w:p>
+            <w:pPr>
+              <w:pStyle w:val="TableContents"/>
+              <w:widowControl w:val="false"/>
+              <w:numPr>
+                <w:ilvl w:val="0"/>
+                <w:numId w:val="1"/>
+              </w:numPr>
+              <w:rPr>
+                <w:b w:val="false"/>
+                <w:bCs w:val="false"/>
+                <w:sz w:val="22"/>
+                <w:szCs w:val="22"/>
+              </w:rPr>
+            </w:pPr>
+            <w:r>
+              <w:rPr>
+                <w:b w:val="false"/>
+                <w:bCs w:val="false"/>
+                <w:sz w:val="22"/>
+                <w:szCs w:val="22"/>
+              </w:rPr>
+              <w:t>3C nn […]</w:t>
+            </w:r>
+          </w:p>
+        </w:tc>
+        <w:tc>
+          <w:tcPr>
+            <w:tcW w:w="4277" w:type="dxa"/>
+            <w:tcBorders>
+              <w:left w:val="single" w:sz="4" w:space="0" w:color="000000"/>
+              <w:bottom w:val="single" w:sz="4" w:space="0" w:color="000000"/>
+              <w:right w:val="single" w:sz="4" w:space="0" w:color="000000"/>
+            </w:tcBorders>
+          </w:tcPr>
+          <w:p>
+            <w:pPr>
+              <w:pStyle w:val="TableContents"/>
+              <w:widowControl w:val="false"/>
+              <w:numPr>
+                <w:ilvl w:val="0"/>
+                <w:numId w:val="1"/>
+              </w:numPr>
+              <w:rPr>
+                <w:rFonts w:ascii="Arial" w:hAnsi="Arial" w:eastAsia="Noto Serif CJK SC" w:cs="Mangal"/>
+                <w:color w:val="auto"/>
+                <w:kern w:val="2"/>
+                <w:sz w:val="16"/>
+                <w:szCs w:val="16"/>
+                <w:lang w:val="en-US" w:eastAsia="zh-CN" w:bidi="hi-IN"/>
+              </w:rPr>
+            </w:pPr>
+            <w:r>
+              <w:rPr>
+                <w:rFonts w:eastAsia="Noto Serif CJK SC" w:cs="Mangal"/>
+                <w:color w:val="auto"/>
+                <w:kern w:val="2"/>
+                <w:sz w:val="16"/>
+                <w:szCs w:val="16"/>
+                <w:lang w:val="en-US" w:eastAsia="zh-CN" w:bidi="hi-IN"/>
+              </w:rPr>
+              <w:t>Cameras supported in the current view for switching purposes. Byte nn indicates the selected camera.</w:t>
+            </w:r>
+          </w:p>
+        </w:tc>
+      </w:tr>
+      <w:tr>
+        <w:trPr/>
+        <w:tc>
+          <w:tcPr>
+            <w:tcW w:w="952" w:type="dxa"/>
+            <w:tcBorders>
+              <w:left w:val="single" w:sz="4" w:space="0" w:color="000000"/>
+              <w:bottom w:val="single" w:sz="4" w:space="0" w:color="000000"/>
+            </w:tcBorders>
+          </w:tcPr>
+          <w:p>
+            <w:pPr>
+              <w:pStyle w:val="TableContents"/>
+              <w:widowControl w:val="false"/>
+              <w:numPr>
+                <w:ilvl w:val="0"/>
+                <w:numId w:val="1"/>
+              </w:numPr>
+              <w:rPr>
+                <w:b w:val="false"/>
+                <w:bCs w:val="false"/>
+                <w:sz w:val="22"/>
+                <w:szCs w:val="22"/>
+              </w:rPr>
+            </w:pPr>
+            <w:r>
+              <w:rPr>
+                <w:b w:val="false"/>
+                <w:bCs w:val="false"/>
+                <w:sz w:val="22"/>
+                <w:szCs w:val="22"/>
+              </w:rPr>
+              <w:t>57</w:t>
+            </w:r>
+          </w:p>
+        </w:tc>
+        <w:tc>
+          <w:tcPr>
+            <w:tcW w:w="847" w:type="dxa"/>
+            <w:tcBorders>
+              <w:left w:val="single" w:sz="4" w:space="0" w:color="000000"/>
+              <w:bottom w:val="single" w:sz="4" w:space="0" w:color="000000"/>
+            </w:tcBorders>
+          </w:tcPr>
+          <w:p>
+            <w:pPr>
+              <w:pStyle w:val="TableContents"/>
+              <w:widowControl w:val="false"/>
+              <w:numPr>
+                <w:ilvl w:val="0"/>
+                <w:numId w:val="1"/>
+              </w:numPr>
+              <w:rPr>
+                <w:b w:val="false"/>
+                <w:bCs w:val="false"/>
+                <w:sz w:val="22"/>
+                <w:szCs w:val="22"/>
+              </w:rPr>
+            </w:pPr>
+            <w:r>
+              <w:rPr>
+                <w:b w:val="false"/>
+                <w:bCs w:val="false"/>
+                <w:sz w:val="22"/>
+                <w:szCs w:val="22"/>
+              </w:rPr>
+              <w:t>2</w:t>
+            </w:r>
+          </w:p>
+        </w:tc>
+        <w:tc>
+          <w:tcPr>
+            <w:tcW w:w="1399" w:type="dxa"/>
+            <w:tcBorders>
+              <w:left w:val="single" w:sz="4" w:space="0" w:color="000000"/>
+              <w:bottom w:val="single" w:sz="4" w:space="0" w:color="000000"/>
+            </w:tcBorders>
+          </w:tcPr>
+          <w:p>
+            <w:pPr>
+              <w:pStyle w:val="TableContents"/>
+              <w:widowControl w:val="false"/>
+              <w:numPr>
+                <w:ilvl w:val="0"/>
+                <w:numId w:val="1"/>
+              </w:numPr>
+              <w:rPr>
+                <w:b w:val="false"/>
+                <w:bCs w:val="false"/>
+                <w:sz w:val="22"/>
+                <w:szCs w:val="22"/>
+              </w:rPr>
+            </w:pPr>
+            <w:r>
+              <w:rPr>
+                <w:b w:val="false"/>
+                <w:bCs w:val="false"/>
+                <w:sz w:val="22"/>
+                <w:szCs w:val="22"/>
+              </w:rPr>
+              <w:t>1</w:t>
+            </w:r>
+          </w:p>
+        </w:tc>
+        <w:tc>
+          <w:tcPr>
+            <w:tcW w:w="2497" w:type="dxa"/>
+            <w:tcBorders>
+              <w:left w:val="single" w:sz="4" w:space="0" w:color="000000"/>
+              <w:bottom w:val="single" w:sz="4" w:space="0" w:color="000000"/>
+            </w:tcBorders>
+          </w:tcPr>
+          <w:p>
+            <w:pPr>
+              <w:pStyle w:val="TableContents"/>
+              <w:widowControl w:val="false"/>
+              <w:numPr>
+                <w:ilvl w:val="0"/>
+                <w:numId w:val="1"/>
+              </w:numPr>
+              <w:rPr>
+                <w:b w:val="false"/>
+                <w:bCs w:val="false"/>
+                <w:sz w:val="22"/>
+                <w:szCs w:val="22"/>
+              </w:rPr>
+            </w:pPr>
+            <w:r>
+              <w:rPr>
+                <w:b w:val="false"/>
+                <w:bCs w:val="false"/>
+                <w:sz w:val="22"/>
+                <w:szCs w:val="22"/>
+              </w:rPr>
+              <w:t>36 nn</w:t>
+            </w:r>
+          </w:p>
+        </w:tc>
+        <w:tc>
+          <w:tcPr>
+            <w:tcW w:w="4277" w:type="dxa"/>
+            <w:tcBorders>
+              <w:left w:val="single" w:sz="4" w:space="0" w:color="000000"/>
+              <w:bottom w:val="single" w:sz="4" w:space="0" w:color="000000"/>
+              <w:right w:val="single" w:sz="4" w:space="0" w:color="000000"/>
+            </w:tcBorders>
+          </w:tcPr>
+          <w:p>
+            <w:pPr>
+              <w:pStyle w:val="TableContents"/>
+              <w:widowControl w:val="false"/>
+              <w:numPr>
+                <w:ilvl w:val="0"/>
+                <w:numId w:val="1"/>
+              </w:numPr>
+              <w:rPr>
+                <w:rFonts w:ascii="Arial" w:hAnsi="Arial" w:eastAsia="Noto Serif CJK SC" w:cs="Mangal"/>
+                <w:color w:val="auto"/>
+                <w:kern w:val="2"/>
+                <w:sz w:val="16"/>
+                <w:szCs w:val="16"/>
+                <w:lang w:val="en-US" w:eastAsia="zh-CN" w:bidi="hi-IN"/>
+              </w:rPr>
+            </w:pPr>
+            <w:r>
+              <w:rPr>
+                <w:rFonts w:eastAsia="Noto Serif CJK SC" w:cs="Mangal"/>
+                <w:color w:val="auto"/>
+                <w:kern w:val="2"/>
+                <w:sz w:val="16"/>
+                <w:szCs w:val="16"/>
+                <w:lang w:val="en-US" w:eastAsia="zh-CN" w:bidi="hi-IN"/>
+              </w:rPr>
+              <w:t>Steering angle for trajectory display. 00 indicates do not display, 80 indicates that the wheel is centered.</w:t>
+            </w:r>
+          </w:p>
+        </w:tc>
+      </w:tr>
+      <w:tr>
+        <w:trPr/>
+        <w:tc>
+          <w:tcPr>
+            <w:tcW w:w="952" w:type="dxa"/>
+            <w:tcBorders>
+              <w:left w:val="single" w:sz="4" w:space="0" w:color="000000"/>
+              <w:bottom w:val="single" w:sz="4" w:space="0" w:color="000000"/>
+            </w:tcBorders>
+          </w:tcPr>
+          <w:p>
+            <w:pPr>
+              <w:pStyle w:val="TableContents"/>
+              <w:widowControl w:val="false"/>
+              <w:numPr>
+                <w:ilvl w:val="0"/>
+                <w:numId w:val="1"/>
+              </w:numPr>
+              <w:rPr>
+                <w:b w:val="false"/>
+                <w:bCs w:val="false"/>
+                <w:sz w:val="22"/>
+                <w:szCs w:val="22"/>
+              </w:rPr>
+            </w:pPr>
+            <w:r>
+              <w:rPr>
+                <w:b w:val="false"/>
+                <w:bCs w:val="false"/>
+                <w:sz w:val="22"/>
+                <w:szCs w:val="22"/>
+              </w:rPr>
+              <w:t>57, 61</w:t>
+            </w:r>
+          </w:p>
+        </w:tc>
+        <w:tc>
+          <w:tcPr>
+            <w:tcW w:w="847" w:type="dxa"/>
+            <w:tcBorders>
+              <w:left w:val="single" w:sz="4" w:space="0" w:color="000000"/>
+              <w:bottom w:val="single" w:sz="4" w:space="0" w:color="000000"/>
+            </w:tcBorders>
+          </w:tcPr>
+          <w:p>
+            <w:pPr>
+              <w:pStyle w:val="TableContents"/>
+              <w:widowControl w:val="false"/>
+              <w:numPr>
+                <w:ilvl w:val="0"/>
+                <w:numId w:val="1"/>
+              </w:numPr>
+              <w:rPr>
+                <w:b w:val="false"/>
+                <w:bCs w:val="false"/>
+                <w:sz w:val="22"/>
+                <w:szCs w:val="22"/>
+              </w:rPr>
+            </w:pPr>
+            <w:r>
+              <w:rPr>
+                <w:b w:val="false"/>
+                <w:bCs w:val="false"/>
+                <w:sz w:val="22"/>
+                <w:szCs w:val="22"/>
+              </w:rPr>
+              <w:t>9</w:t>
+            </w:r>
+          </w:p>
+        </w:tc>
+        <w:tc>
+          <w:tcPr>
+            <w:tcW w:w="1399" w:type="dxa"/>
+            <w:tcBorders>
+              <w:left w:val="single" w:sz="4" w:space="0" w:color="000000"/>
+              <w:bottom w:val="single" w:sz="4" w:space="0" w:color="000000"/>
+            </w:tcBorders>
+          </w:tcPr>
+          <w:p>
+            <w:pPr>
+              <w:pStyle w:val="TableContents"/>
+              <w:widowControl w:val="false"/>
+              <w:numPr>
+                <w:ilvl w:val="0"/>
+                <w:numId w:val="1"/>
+              </w:numPr>
+              <w:rPr>
+                <w:b w:val="false"/>
+                <w:bCs w:val="false"/>
+                <w:sz w:val="22"/>
+                <w:szCs w:val="22"/>
+              </w:rPr>
+            </w:pPr>
+            <w:r>
+              <w:rPr>
+                <w:b w:val="false"/>
+                <w:bCs w:val="false"/>
+                <w:sz w:val="22"/>
+                <w:szCs w:val="22"/>
+              </w:rPr>
+              <w:t>1</w:t>
+            </w:r>
+          </w:p>
+        </w:tc>
+        <w:tc>
+          <w:tcPr>
+            <w:tcW w:w="2497" w:type="dxa"/>
+            <w:tcBorders>
+              <w:left w:val="single" w:sz="4" w:space="0" w:color="000000"/>
+              <w:bottom w:val="single" w:sz="4" w:space="0" w:color="000000"/>
+            </w:tcBorders>
+          </w:tcPr>
+          <w:p>
+            <w:pPr>
+              <w:pStyle w:val="TableContents"/>
+              <w:widowControl w:val="false"/>
+              <w:numPr>
+                <w:ilvl w:val="0"/>
+                <w:numId w:val="1"/>
+              </w:numPr>
+              <w:rPr>
+                <w:b w:val="false"/>
+                <w:bCs w:val="false"/>
+                <w:sz w:val="22"/>
+                <w:szCs w:val="22"/>
+              </w:rPr>
+            </w:pPr>
+            <w:r>
+              <w:rPr>
+                <w:b w:val="false"/>
+                <w:bCs w:val="false"/>
+                <w:sz w:val="22"/>
+                <w:szCs w:val="22"/>
+              </w:rPr>
+              <w:t>37 w1 w1 w2 w2 y1 y1 y2 y2</w:t>
+            </w:r>
+          </w:p>
+        </w:tc>
+        <w:tc>
+          <w:tcPr>
+            <w:tcW w:w="4277" w:type="dxa"/>
+            <w:tcBorders>
+              <w:left w:val="single" w:sz="4" w:space="0" w:color="000000"/>
+              <w:bottom w:val="single" w:sz="4" w:space="0" w:color="000000"/>
+              <w:right w:val="single" w:sz="4" w:space="0" w:color="000000"/>
+            </w:tcBorders>
+          </w:tcPr>
+          <w:p>
+            <w:pPr>
+              <w:pStyle w:val="TableContents"/>
+              <w:widowControl w:val="false"/>
+              <w:numPr>
+                <w:ilvl w:val="0"/>
+                <w:numId w:val="1"/>
+              </w:numPr>
+              <w:rPr>
+                <w:rFonts w:ascii="Arial" w:hAnsi="Arial" w:eastAsia="Noto Serif CJK SC" w:cs="Mangal"/>
+                <w:color w:val="auto"/>
+                <w:kern w:val="2"/>
+                <w:sz w:val="16"/>
+                <w:szCs w:val="16"/>
+                <w:lang w:val="en-US" w:eastAsia="zh-CN" w:bidi="hi-IN"/>
+              </w:rPr>
+            </w:pPr>
+            <w:r>
+              <w:rPr>
+                <w:rFonts w:eastAsia="Noto Serif CJK SC" w:cs="Mangal"/>
+                <w:color w:val="auto"/>
+                <w:kern w:val="2"/>
+                <w:sz w:val="16"/>
+                <w:szCs w:val="16"/>
+                <w:lang w:val="en-US" w:eastAsia="zh-CN" w:bidi="hi-IN"/>
+              </w:rPr>
+              <w:t>Distance/trajectory position. Defined as top width, bottom width, top position, and bottom position. Always centered.</w:t>
+            </w:r>
+          </w:p>
+        </w:tc>
+      </w:tr>
+      <w:tr>
+        <w:trPr/>
+        <w:tc>
+          <w:tcPr>
+            <w:tcW w:w="952" w:type="dxa"/>
+            <w:tcBorders>
+              <w:left w:val="single" w:sz="4" w:space="0" w:color="000000"/>
+              <w:bottom w:val="single" w:sz="4" w:space="0" w:color="000000"/>
+            </w:tcBorders>
+          </w:tcPr>
+          <w:p>
+            <w:pPr>
+              <w:pStyle w:val="TableContents"/>
+              <w:widowControl w:val="false"/>
+              <w:numPr>
+                <w:ilvl w:val="0"/>
+                <w:numId w:val="1"/>
+              </w:numPr>
+              <w:rPr>
+                <w:b w:val="false"/>
+                <w:bCs w:val="false"/>
+                <w:sz w:val="22"/>
+                <w:szCs w:val="22"/>
+              </w:rPr>
+            </w:pPr>
+            <w:r>
+              <w:rPr>
+                <w:b w:val="false"/>
+                <w:bCs w:val="false"/>
+                <w:sz w:val="22"/>
+                <w:szCs w:val="22"/>
+              </w:rPr>
+              <w:t>61</w:t>
+            </w:r>
+          </w:p>
+        </w:tc>
+        <w:tc>
+          <w:tcPr>
+            <w:tcW w:w="847" w:type="dxa"/>
+            <w:tcBorders>
+              <w:left w:val="single" w:sz="4" w:space="0" w:color="000000"/>
+              <w:bottom w:val="single" w:sz="4" w:space="0" w:color="000000"/>
+            </w:tcBorders>
+          </w:tcPr>
+          <w:p>
+            <w:pPr>
+              <w:pStyle w:val="TableContents"/>
+              <w:widowControl w:val="false"/>
+              <w:numPr>
+                <w:ilvl w:val="0"/>
+                <w:numId w:val="1"/>
+              </w:numPr>
+              <w:rPr>
+                <w:b w:val="false"/>
+                <w:bCs w:val="false"/>
+                <w:sz w:val="22"/>
+                <w:szCs w:val="22"/>
+              </w:rPr>
+            </w:pPr>
+            <w:r>
+              <w:rPr>
+                <w:b w:val="false"/>
+                <w:bCs w:val="false"/>
+                <w:sz w:val="22"/>
+                <w:szCs w:val="22"/>
+              </w:rPr>
+              <w:t>Varies</w:t>
+            </w:r>
+          </w:p>
+        </w:tc>
+        <w:tc>
+          <w:tcPr>
+            <w:tcW w:w="1399" w:type="dxa"/>
+            <w:tcBorders>
+              <w:left w:val="single" w:sz="4" w:space="0" w:color="000000"/>
+              <w:bottom w:val="single" w:sz="4" w:space="0" w:color="000000"/>
+            </w:tcBorders>
+          </w:tcPr>
+          <w:p>
+            <w:pPr>
+              <w:pStyle w:val="TableContents"/>
+              <w:widowControl w:val="false"/>
+              <w:numPr>
+                <w:ilvl w:val="0"/>
+                <w:numId w:val="1"/>
+              </w:numPr>
+              <w:rPr>
+                <w:b w:val="false"/>
+                <w:bCs w:val="false"/>
+                <w:sz w:val="22"/>
+                <w:szCs w:val="22"/>
+              </w:rPr>
+            </w:pPr>
+            <w:r>
+              <w:rPr>
+                <w:b w:val="false"/>
+                <w:bCs w:val="false"/>
+                <w:sz w:val="22"/>
+                <w:szCs w:val="22"/>
+              </w:rPr>
+              <w:t>1</w:t>
+            </w:r>
+          </w:p>
+        </w:tc>
+        <w:tc>
+          <w:tcPr>
+            <w:tcW w:w="2497" w:type="dxa"/>
+            <w:tcBorders>
+              <w:left w:val="single" w:sz="4" w:space="0" w:color="000000"/>
+              <w:bottom w:val="single" w:sz="4" w:space="0" w:color="000000"/>
+            </w:tcBorders>
+          </w:tcPr>
+          <w:p>
+            <w:pPr>
+              <w:pStyle w:val="TableContents"/>
+              <w:widowControl w:val="false"/>
+              <w:numPr>
+                <w:ilvl w:val="0"/>
+                <w:numId w:val="1"/>
+              </w:numPr>
+              <w:rPr>
+                <w:b w:val="false"/>
+                <w:bCs w:val="false"/>
+                <w:sz w:val="22"/>
+                <w:szCs w:val="22"/>
+              </w:rPr>
+            </w:pPr>
+            <w:r>
+              <w:rPr>
+                <w:b w:val="false"/>
+                <w:bCs w:val="false"/>
+                <w:sz w:val="22"/>
+                <w:szCs w:val="22"/>
+              </w:rPr>
+              <w:t>25 57 61 […]</w:t>
+            </w:r>
+          </w:p>
+        </w:tc>
+        <w:tc>
+          <w:tcPr>
+            <w:tcW w:w="4277" w:type="dxa"/>
+            <w:tcBorders>
+              <w:left w:val="single" w:sz="4" w:space="0" w:color="000000"/>
+              <w:bottom w:val="single" w:sz="4" w:space="0" w:color="000000"/>
+              <w:right w:val="single" w:sz="4" w:space="0" w:color="000000"/>
+            </w:tcBorders>
+          </w:tcPr>
+          <w:p>
+            <w:pPr>
+              <w:pStyle w:val="TableContents"/>
+              <w:widowControl w:val="false"/>
+              <w:numPr>
+                <w:ilvl w:val="0"/>
+                <w:numId w:val="1"/>
+              </w:numPr>
+              <w:rPr>
+                <w:rFonts w:ascii="Arial" w:hAnsi="Arial" w:eastAsia="Noto Serif CJK SC" w:cs="Mangal"/>
+                <w:color w:val="auto"/>
+                <w:kern w:val="2"/>
+                <w:sz w:val="16"/>
+                <w:szCs w:val="16"/>
+                <w:lang w:val="en-US" w:eastAsia="zh-CN" w:bidi="hi-IN"/>
+              </w:rPr>
+            </w:pPr>
+            <w:r>
+              <w:rPr>
+                <w:rFonts w:eastAsia="Noto Serif CJK SC" w:cs="Mangal"/>
+                <w:color w:val="auto"/>
+                <w:kern w:val="2"/>
+                <w:sz w:val="16"/>
+                <w:szCs w:val="16"/>
+                <w:lang w:val="en-US" w:eastAsia="zh-CN" w:bidi="hi-IN"/>
+              </w:rPr>
+              <w:t>Camera warning message to display at the bottom of the screen. If not specified, the default “Please Check Surroundings for Safety” is used.</w:t>
+            </w:r>
+          </w:p>
+        </w:tc>
+      </w:tr>
+      <w:tr>
+        <w:trPr/>
+        <w:tc>
+          <w:tcPr>
+            <w:tcW w:w="952" w:type="dxa"/>
+            <w:tcBorders>
+              <w:left w:val="single" w:sz="4" w:space="0" w:color="000000"/>
+              <w:bottom w:val="single" w:sz="4" w:space="0" w:color="000000"/>
+            </w:tcBorders>
+          </w:tcPr>
+          <w:p>
+            <w:pPr>
+              <w:pStyle w:val="TableContents"/>
+              <w:widowControl w:val="false"/>
+              <w:numPr>
+                <w:ilvl w:val="0"/>
+                <w:numId w:val="1"/>
+              </w:numPr>
+              <w:rPr>
+                <w:b w:val="false"/>
+                <w:bCs w:val="false"/>
+                <w:sz w:val="22"/>
+                <w:szCs w:val="22"/>
+              </w:rPr>
+            </w:pPr>
+            <w:r>
+              <w:rPr>
+                <w:b w:val="false"/>
+                <w:bCs w:val="false"/>
+                <w:sz w:val="22"/>
+                <w:szCs w:val="22"/>
+              </w:rPr>
+              <w:t>61</w:t>
+            </w:r>
+          </w:p>
+        </w:tc>
+        <w:tc>
+          <w:tcPr>
+            <w:tcW w:w="847" w:type="dxa"/>
+            <w:tcBorders>
+              <w:left w:val="single" w:sz="4" w:space="0" w:color="000000"/>
+              <w:bottom w:val="single" w:sz="4" w:space="0" w:color="000000"/>
+            </w:tcBorders>
+          </w:tcPr>
+          <w:p>
+            <w:pPr>
+              <w:pStyle w:val="TableContents"/>
+              <w:widowControl w:val="false"/>
+              <w:numPr>
+                <w:ilvl w:val="0"/>
+                <w:numId w:val="1"/>
+              </w:numPr>
+              <w:rPr>
+                <w:b w:val="false"/>
+                <w:bCs w:val="false"/>
+                <w:sz w:val="22"/>
+                <w:szCs w:val="22"/>
+              </w:rPr>
+            </w:pPr>
+            <w:r>
+              <w:rPr>
+                <w:b w:val="false"/>
+                <w:bCs w:val="false"/>
+                <w:sz w:val="22"/>
+                <w:szCs w:val="22"/>
+              </w:rPr>
+              <w:t>Varies</w:t>
+            </w:r>
+          </w:p>
+        </w:tc>
+        <w:tc>
+          <w:tcPr>
+            <w:tcW w:w="1399" w:type="dxa"/>
+            <w:tcBorders>
+              <w:left w:val="single" w:sz="4" w:space="0" w:color="000000"/>
+              <w:bottom w:val="single" w:sz="4" w:space="0" w:color="000000"/>
+            </w:tcBorders>
+          </w:tcPr>
+          <w:p>
+            <w:pPr>
+              <w:pStyle w:val="TableContents"/>
+              <w:widowControl w:val="false"/>
+              <w:numPr>
+                <w:ilvl w:val="0"/>
+                <w:numId w:val="1"/>
+              </w:numPr>
+              <w:rPr>
+                <w:b w:val="false"/>
+                <w:bCs w:val="false"/>
+                <w:sz w:val="22"/>
+                <w:szCs w:val="22"/>
+              </w:rPr>
+            </w:pPr>
+            <w:r>
+              <w:rPr>
+                <w:b w:val="false"/>
+                <w:bCs w:val="false"/>
+                <w:sz w:val="22"/>
+                <w:szCs w:val="22"/>
+              </w:rPr>
+              <w:t>1</w:t>
+            </w:r>
+          </w:p>
+        </w:tc>
+        <w:tc>
+          <w:tcPr>
+            <w:tcW w:w="2497" w:type="dxa"/>
+            <w:tcBorders>
+              <w:left w:val="single" w:sz="4" w:space="0" w:color="000000"/>
+              <w:bottom w:val="single" w:sz="4" w:space="0" w:color="000000"/>
+            </w:tcBorders>
+          </w:tcPr>
+          <w:p>
+            <w:pPr>
+              <w:pStyle w:val="TableContents"/>
+              <w:widowControl w:val="false"/>
+              <w:numPr>
+                <w:ilvl w:val="0"/>
+                <w:numId w:val="1"/>
+              </w:numPr>
+              <w:rPr>
+                <w:b w:val="false"/>
+                <w:bCs w:val="false"/>
+                <w:sz w:val="22"/>
+                <w:szCs w:val="22"/>
+              </w:rPr>
+            </w:pPr>
+            <w:r>
+              <w:rPr>
+                <w:b w:val="false"/>
+                <w:bCs w:val="false"/>
+                <w:sz w:val="22"/>
+                <w:szCs w:val="22"/>
+              </w:rPr>
+              <w:t>25 57 62 […]</w:t>
+            </w:r>
+          </w:p>
+        </w:tc>
+        <w:tc>
+          <w:tcPr>
+            <w:tcW w:w="4277" w:type="dxa"/>
+            <w:tcBorders>
+              <w:left w:val="single" w:sz="4" w:space="0" w:color="000000"/>
+              <w:bottom w:val="single" w:sz="4" w:space="0" w:color="000000"/>
+              <w:right w:val="single" w:sz="4" w:space="0" w:color="000000"/>
+            </w:tcBorders>
+          </w:tcPr>
+          <w:p>
+            <w:pPr>
+              <w:pStyle w:val="TableContents"/>
+              <w:widowControl w:val="false"/>
+              <w:numPr>
+                <w:ilvl w:val="0"/>
+                <w:numId w:val="1"/>
+              </w:numPr>
+              <w:rPr>
+                <w:rFonts w:ascii="Arial" w:hAnsi="Arial" w:eastAsia="Noto Serif CJK SC" w:cs="Mangal"/>
+                <w:color w:val="auto"/>
+                <w:kern w:val="2"/>
+                <w:sz w:val="16"/>
+                <w:szCs w:val="16"/>
+                <w:lang w:val="en-US" w:eastAsia="zh-CN" w:bidi="hi-IN"/>
+              </w:rPr>
+            </w:pPr>
+            <w:r>
+              <w:rPr>
+                <w:rFonts w:eastAsia="Noto Serif CJK SC" w:cs="Mangal"/>
+                <w:color w:val="auto"/>
+                <w:kern w:val="2"/>
+                <w:sz w:val="16"/>
+                <w:szCs w:val="16"/>
+                <w:lang w:val="en-US" w:eastAsia="zh-CN" w:bidi="hi-IN"/>
+              </w:rPr>
+              <w:t>Camera video path.</w:t>
             </w:r>
           </w:p>
         </w:tc>
@@ -46363,6 +48378,143 @@
   <w:abstractNum w:abstractNumId="24">
     <w:lvl w:ilvl="0">
       <w:start w:val="1"/>
+      <w:numFmt w:val="bullet"/>
+      <w:lvlText w:val=""/>
+      <w:lvlJc w:val="left"/>
+      <w:pPr>
+        <w:tabs>
+          <w:tab w:val="num" w:pos="720"/>
+        </w:tabs>
+        <w:ind w:left="720" w:hanging="360"/>
+      </w:pPr>
+      <w:rPr>
+        <w:rFonts w:ascii="Symbol" w:hAnsi="Symbol" w:cs="Symbol" w:hint="default"/>
+      </w:rPr>
+    </w:lvl>
+    <w:lvl w:ilvl="1">
+      <w:start w:val="1"/>
+      <w:numFmt w:val="bullet"/>
+      <w:lvlText w:val="◦"/>
+      <w:lvlJc w:val="left"/>
+      <w:pPr>
+        <w:tabs>
+          <w:tab w:val="num" w:pos="1080"/>
+        </w:tabs>
+        <w:ind w:left="1080" w:hanging="360"/>
+      </w:pPr>
+      <w:rPr>
+        <w:rFonts w:ascii="OpenSymbol" w:hAnsi="OpenSymbol" w:cs="OpenSymbol" w:hint="default"/>
+      </w:rPr>
+    </w:lvl>
+    <w:lvl w:ilvl="2">
+      <w:start w:val="1"/>
+      <w:numFmt w:val="bullet"/>
+      <w:lvlText w:val="▪"/>
+      <w:lvlJc w:val="left"/>
+      <w:pPr>
+        <w:tabs>
+          <w:tab w:val="num" w:pos="1440"/>
+        </w:tabs>
+        <w:ind w:left="1440" w:hanging="360"/>
+      </w:pPr>
+      <w:rPr>
+        <w:rFonts w:ascii="OpenSymbol" w:hAnsi="OpenSymbol" w:cs="OpenSymbol" w:hint="default"/>
+      </w:rPr>
+    </w:lvl>
+    <w:lvl w:ilvl="3">
+      <w:start w:val="1"/>
+      <w:numFmt w:val="bullet"/>
+      <w:lvlText w:val=""/>
+      <w:lvlJc w:val="left"/>
+      <w:pPr>
+        <w:tabs>
+          <w:tab w:val="num" w:pos="1800"/>
+        </w:tabs>
+        <w:ind w:left="1800" w:hanging="360"/>
+      </w:pPr>
+      <w:rPr>
+        <w:rFonts w:ascii="Symbol" w:hAnsi="Symbol" w:cs="Symbol" w:hint="default"/>
+      </w:rPr>
+    </w:lvl>
+    <w:lvl w:ilvl="4">
+      <w:start w:val="1"/>
+      <w:numFmt w:val="bullet"/>
+      <w:lvlText w:val="◦"/>
+      <w:lvlJc w:val="left"/>
+      <w:pPr>
+        <w:tabs>
+          <w:tab w:val="num" w:pos="2160"/>
+        </w:tabs>
+        <w:ind w:left="2160" w:hanging="360"/>
+      </w:pPr>
+      <w:rPr>
+        <w:rFonts w:ascii="OpenSymbol" w:hAnsi="OpenSymbol" w:cs="OpenSymbol" w:hint="default"/>
+      </w:rPr>
+    </w:lvl>
+    <w:lvl w:ilvl="5">
+      <w:start w:val="1"/>
+      <w:numFmt w:val="bullet"/>
+      <w:lvlText w:val="▪"/>
+      <w:lvlJc w:val="left"/>
+      <w:pPr>
+        <w:tabs>
+          <w:tab w:val="num" w:pos="2520"/>
+        </w:tabs>
+        <w:ind w:left="2520" w:hanging="360"/>
+      </w:pPr>
+      <w:rPr>
+        <w:rFonts w:ascii="OpenSymbol" w:hAnsi="OpenSymbol" w:cs="OpenSymbol" w:hint="default"/>
+      </w:rPr>
+    </w:lvl>
+    <w:lvl w:ilvl="6">
+      <w:start w:val="1"/>
+      <w:numFmt w:val="bullet"/>
+      <w:lvlText w:val=""/>
+      <w:lvlJc w:val="left"/>
+      <w:pPr>
+        <w:tabs>
+          <w:tab w:val="num" w:pos="2880"/>
+        </w:tabs>
+        <w:ind w:left="2880" w:hanging="360"/>
+      </w:pPr>
+      <w:rPr>
+        <w:rFonts w:ascii="Symbol" w:hAnsi="Symbol" w:cs="Symbol" w:hint="default"/>
+      </w:rPr>
+    </w:lvl>
+    <w:lvl w:ilvl="7">
+      <w:start w:val="1"/>
+      <w:numFmt w:val="bullet"/>
+      <w:lvlText w:val="◦"/>
+      <w:lvlJc w:val="left"/>
+      <w:pPr>
+        <w:tabs>
+          <w:tab w:val="num" w:pos="3240"/>
+        </w:tabs>
+        <w:ind w:left="3240" w:hanging="360"/>
+      </w:pPr>
+      <w:rPr>
+        <w:rFonts w:ascii="OpenSymbol" w:hAnsi="OpenSymbol" w:cs="OpenSymbol" w:hint="default"/>
+      </w:rPr>
+    </w:lvl>
+    <w:lvl w:ilvl="8">
+      <w:start w:val="1"/>
+      <w:numFmt w:val="bullet"/>
+      <w:lvlText w:val="▪"/>
+      <w:lvlJc w:val="left"/>
+      <w:pPr>
+        <w:tabs>
+          <w:tab w:val="num" w:pos="3600"/>
+        </w:tabs>
+        <w:ind w:left="3600" w:hanging="360"/>
+      </w:pPr>
+      <w:rPr>
+        <w:rFonts w:ascii="OpenSymbol" w:hAnsi="OpenSymbol" w:cs="OpenSymbol" w:hint="default"/>
+      </w:rPr>
+    </w:lvl>
+  </w:abstractNum>
+  <w:abstractNum w:abstractNumId="25">
+    <w:lvl w:ilvl="0">
+      <w:start w:val="1"/>
       <w:numFmt w:val="none"/>
       <w:suff w:val="nothing"/>
       <w:lvlText w:val=""/>
@@ -46550,6 +48702,9 @@
   </w:num>
   <w:num w:numId="24">
     <w:abstractNumId w:val="24"/>
+  </w:num>
+  <w:num w:numId="25">
+    <w:abstractNumId w:val="25"/>
   </w:num>
 </w:numbering>
 </file>

</xml_diff>